<commit_message>
chore: save project progress locally
</commit_message>
<xml_diff>
--- a/promt.docx
+++ b/promt.docx
@@ -11,6 +11,59 @@
           <w:bottom w:val="single" w:sz="2" w:space="0" w:color="E5E7EB"/>
           <w:right w:val="single" w:sz="2" w:space="0" w:color="E5E7EB"/>
         </w:pBdr>
+        <w:shd w:val="clear" w:color="auto" w:fill="252526"/>
+        <w:spacing w:before="100" w:beforeAutospacing="1" w:after="100" w:afterAutospacing="1"/>
+        <w:jc w:val="left"/>
+        <w:outlineLvl w:val="2"/>
+        <w:rPr>
+          <w:rFonts w:ascii="Segoe UI" w:eastAsia="宋体" w:hAnsi="Segoe UI" w:cs="Segoe UI"/>
+          <w:color w:val="CCCCCC"/>
+          <w:kern w:val="0"/>
+          <w:sz w:val="27"/>
+          <w:szCs w:val="27"/>
+        </w:rPr>
+      </w:pPr>
+      <w:r>
+        <w:rPr>
+          <w:rFonts w:ascii="Segoe UI Emoji" w:eastAsia="宋体" w:hAnsi="Segoe UI Emoji" w:cs="Segoe UI Emoji"/>
+          <w:color w:val="CCCCCC"/>
+          <w:kern w:val="0"/>
+          <w:sz w:val="27"/>
+          <w:szCs w:val="27"/>
+        </w:rPr>
+        <w:t>🚀</w:t>
+      </w:r>
+      <w:r>
+        <w:rPr>
+          <w:rFonts w:ascii="Segoe UI" w:eastAsia="宋体" w:hAnsi="Segoe UI" w:cs="Segoe UI"/>
+          <w:color w:val="CCCCCC"/>
+          <w:kern w:val="0"/>
+          <w:sz w:val="27"/>
+          <w:szCs w:val="27"/>
+        </w:rPr>
+        <w:t xml:space="preserve"> Hive </w:t>
+      </w:r>
+      <w:r>
+        <w:rPr>
+          <w:rFonts w:ascii="Segoe UI" w:eastAsia="宋体" w:hAnsi="Segoe UI" w:cs="Segoe UI"/>
+          <w:color w:val="CCCCCC"/>
+          <w:kern w:val="0"/>
+          <w:sz w:val="27"/>
+          <w:szCs w:val="27"/>
+        </w:rPr>
+        <w:t>项目开发上下文同步提示词</w:t>
+      </w:r>
+    </w:p>
+    <w:p>
+      <w:pPr>
+        <w:widowControl/>
+        <w:pBdr>
+          <w:top w:val="single" w:sz="2" w:space="0" w:color="E5E7EB"/>
+          <w:left w:val="single" w:sz="2" w:space="0" w:color="E5E7EB"/>
+          <w:bottom w:val="single" w:sz="2" w:space="0" w:color="E5E7EB"/>
+          <w:right w:val="single" w:sz="2" w:space="0" w:color="E5E7EB"/>
+        </w:pBdr>
+        <w:shd w:val="clear" w:color="auto" w:fill="252526"/>
         <w:jc w:val="left"/>
         <w:rPr>
           <w:rFonts w:ascii="Segoe UI" w:eastAsia="宋体" w:hAnsi="Segoe UI" w:cs="Segoe UI"/>
@@ -31,7 +84,7 @@
           <w:szCs w:val="20"/>
           <w:bdr w:val="single" w:sz="2" w:space="0" w:color="E5E7EB" w:frame="1"/>
         </w:rPr>
-        <w:t xml:space="preserve">Hi! </w:t>
+        <w:t xml:space="preserve">1. </w:t>
       </w:r>
       <w:r>
         <w:rPr>
@@ -44,7 +97,7 @@
           <w:szCs w:val="20"/>
           <w:bdr w:val="single" w:sz="2" w:space="0" w:color="E5E7EB" w:frame="1"/>
         </w:rPr>
-        <w:t>我们正在开发</w:t>
+        <w:t>项目基本背景</w:t>
       </w:r>
       <w:r>
         <w:rPr>
@@ -57,20 +110,7 @@
           <w:szCs w:val="20"/>
           <w:bdr w:val="single" w:sz="2" w:space="0" w:color="E5E7EB" w:frame="1"/>
         </w:rPr>
-        <w:t xml:space="preserve"> Hive </w:t>
-      </w:r>
-      <w:r>
-        <w:rPr>
-          <w:rFonts w:ascii="Segoe UI" w:eastAsia="宋体" w:hAnsi="Segoe UI" w:cs="Segoe UI"/>
-          <w:b/>
-          <w:bCs/>
-          <w:color w:val="CCCCCC"/>
-          <w:kern w:val="0"/>
-          <w:sz w:val="20"/>
-          <w:szCs w:val="20"/>
-          <w:bdr w:val="single" w:sz="2" w:space="0" w:color="E5E7EB" w:frame="1"/>
-        </w:rPr>
-        <w:t>项目，请立即读取以下文件以恢复当前开发进度：</w:t>
+        <w:t xml:space="preserve"> (Project Background)</w:t>
       </w:r>
     </w:p>
     <w:p>
@@ -78,7 +118,7 @@
         <w:widowControl/>
         <w:numPr>
           <w:ilvl w:val="0"/>
-          <w:numId w:val="1"/>
+          <w:numId w:val="2"/>
         </w:numPr>
         <w:pBdr>
           <w:top w:val="single" w:sz="2" w:space="0" w:color="E5E7EB"/>
@@ -86,6 +126,7 @@
           <w:bottom w:val="single" w:sz="2" w:space="0" w:color="E5E7EB"/>
           <w:right w:val="single" w:sz="2" w:space="0" w:color="E5E7EB"/>
         </w:pBdr>
+        <w:shd w:val="clear" w:color="auto" w:fill="252526"/>
         <w:spacing w:before="100" w:beforeAutospacing="1" w:after="100" w:afterAutospacing="1"/>
         <w:jc w:val="left"/>
         <w:rPr>
@@ -99,23 +140,55 @@
       <w:r>
         <w:rPr>
           <w:rFonts w:ascii="Segoe UI" w:eastAsia="宋体" w:hAnsi="Segoe UI" w:cs="Segoe UI"/>
-          <w:color w:val="CCCCCC"/>
-          <w:kern w:val="0"/>
-          <w:sz w:val="20"/>
-          <w:szCs w:val="20"/>
-        </w:rPr>
-        <w:t>最新工作汇总：</w:t>
-      </w:r>
-      <w:r>
-        <w:rPr>
-          <w:rFonts w:ascii="Segoe UI" w:eastAsia="宋体" w:hAnsi="Segoe UI" w:cs="Segoe UI"/>
-          <w:color w:val="CCCCCC"/>
-          <w:kern w:val="0"/>
-          <w:sz w:val="20"/>
-          <w:szCs w:val="20"/>
-          <w:bdr w:val="single" w:sz="2" w:space="0" w:color="E5E7EB" w:frame="1"/>
-        </w:rPr>
-        <w:t>C:\Users\David.gemini\antigravity\brain\f20c803c-2ad3-4a52-9f18-fafe006073b5\walkthrough.md</w:t>
+          <w:b/>
+          <w:bCs/>
+          <w:color w:val="CCCCCC"/>
+          <w:kern w:val="0"/>
+          <w:sz w:val="20"/>
+          <w:szCs w:val="20"/>
+          <w:bdr w:val="single" w:sz="2" w:space="0" w:color="E5E7EB" w:frame="1"/>
+        </w:rPr>
+        <w:t>名称</w:t>
+      </w:r>
+      <w:r>
+        <w:rPr>
+          <w:rFonts w:ascii="Segoe UI" w:eastAsia="宋体" w:hAnsi="Segoe UI" w:cs="Segoe UI"/>
+          <w:color w:val="CCCCCC"/>
+          <w:kern w:val="0"/>
+          <w:sz w:val="20"/>
+          <w:szCs w:val="20"/>
+        </w:rPr>
+        <w:t>：</w:t>
+      </w:r>
+      <w:r>
+        <w:rPr>
+          <w:rFonts w:ascii="Segoe UI" w:eastAsia="宋体" w:hAnsi="Segoe UI" w:cs="Segoe UI"/>
+          <w:color w:val="CCCCCC"/>
+          <w:kern w:val="0"/>
+          <w:sz w:val="20"/>
+          <w:szCs w:val="20"/>
+        </w:rPr>
+        <w:t>Hive (</w:t>
+      </w:r>
+      <w:r>
+        <w:rPr>
+          <w:rFonts w:ascii="Segoe UI" w:eastAsia="宋体" w:hAnsi="Segoe UI" w:cs="Segoe UI"/>
+          <w:color w:val="CCCCCC"/>
+          <w:kern w:val="0"/>
+          <w:sz w:val="20"/>
+          <w:szCs w:val="20"/>
+        </w:rPr>
+        <w:t>一款移动端优先的专注力社交</w:t>
+      </w:r>
+      <w:r>
+        <w:rPr>
+          <w:rFonts w:ascii="Segoe UI" w:eastAsia="宋体" w:hAnsi="Segoe UI" w:cs="Segoe UI"/>
+          <w:color w:val="CCCCCC"/>
+          <w:kern w:val="0"/>
+          <w:sz w:val="20"/>
+          <w:szCs w:val="20"/>
+        </w:rPr>
+        <w:t xml:space="preserve"> App)</w:t>
       </w:r>
     </w:p>
     <w:p>
@@ -123,7 +196,7 @@
         <w:widowControl/>
         <w:numPr>
           <w:ilvl w:val="0"/>
-          <w:numId w:val="1"/>
+          <w:numId w:val="2"/>
         </w:numPr>
         <w:pBdr>
           <w:top w:val="single" w:sz="2" w:space="0" w:color="E5E7EB"/>
@@ -131,6 +204,7 @@
           <w:bottom w:val="single" w:sz="2" w:space="0" w:color="E5E7EB"/>
           <w:right w:val="single" w:sz="2" w:space="0" w:color="E5E7EB"/>
         </w:pBdr>
+        <w:shd w:val="clear" w:color="auto" w:fill="252526"/>
         <w:spacing w:before="100" w:beforeAutospacing="1" w:after="100" w:afterAutospacing="1"/>
         <w:jc w:val="left"/>
         <w:rPr>
@@ -144,23 +218,207 @@
       <w:r>
         <w:rPr>
           <w:rFonts w:ascii="Segoe UI" w:eastAsia="宋体" w:hAnsi="Segoe UI" w:cs="Segoe UI"/>
-          <w:color w:val="CCCCCC"/>
-          <w:kern w:val="0"/>
-          <w:sz w:val="20"/>
-          <w:szCs w:val="20"/>
-        </w:rPr>
-        <w:t>任务清单：</w:t>
-      </w:r>
-      <w:r>
-        <w:rPr>
-          <w:rFonts w:ascii="Segoe UI" w:eastAsia="宋体" w:hAnsi="Segoe UI" w:cs="Segoe UI"/>
-          <w:color w:val="CCCCCC"/>
-          <w:kern w:val="0"/>
-          <w:sz w:val="20"/>
-          <w:szCs w:val="20"/>
-          <w:bdr w:val="single" w:sz="2" w:space="0" w:color="E5E7EB" w:frame="1"/>
-        </w:rPr>
-        <w:t>C:\Users\David.gemini\antigravity\brain\f20c803c-2ad3-4a52-9f18-fafe006073b5\task.md</w:t>
+          <w:b/>
+          <w:bCs/>
+          <w:color w:val="CCCCCC"/>
+          <w:kern w:val="0"/>
+          <w:sz w:val="20"/>
+          <w:szCs w:val="20"/>
+          <w:bdr w:val="single" w:sz="2" w:space="0" w:color="E5E7EB" w:frame="1"/>
+        </w:rPr>
+        <w:t>核心特性</w:t>
+      </w:r>
+      <w:r>
+        <w:rPr>
+          <w:rFonts w:ascii="Segoe UI" w:eastAsia="宋体" w:hAnsi="Segoe UI" w:cs="Segoe UI"/>
+          <w:color w:val="CCCCCC"/>
+          <w:kern w:val="0"/>
+          <w:sz w:val="20"/>
+          <w:szCs w:val="20"/>
+        </w:rPr>
+        <w:t>：专注倒计时、</w:t>
+      </w:r>
+      <w:r>
+        <w:rPr>
+          <w:rFonts w:ascii="Segoe UI" w:eastAsia="宋体" w:hAnsi="Segoe UI" w:cs="Segoe UI"/>
+          <w:color w:val="CCCCCC"/>
+          <w:kern w:val="0"/>
+          <w:sz w:val="20"/>
+          <w:szCs w:val="20"/>
+        </w:rPr>
+        <w:t>Squads</w:t>
+      </w:r>
+      <w:r>
+        <w:rPr>
+          <w:rFonts w:ascii="Segoe UI" w:eastAsia="宋体" w:hAnsi="Segoe UI" w:cs="Segoe UI"/>
+          <w:color w:val="CCCCCC"/>
+          <w:kern w:val="0"/>
+          <w:sz w:val="20"/>
+          <w:szCs w:val="20"/>
+        </w:rPr>
+        <w:t>（小组组队）、</w:t>
+      </w:r>
+      <w:r>
+        <w:rPr>
+          <w:rFonts w:ascii="Segoe UI" w:eastAsia="宋体" w:hAnsi="Segoe UI" w:cs="Segoe UI"/>
+          <w:color w:val="CCCCCC"/>
+          <w:kern w:val="0"/>
+          <w:sz w:val="20"/>
+          <w:szCs w:val="20"/>
+        </w:rPr>
+        <w:t>Bonds</w:t>
+      </w:r>
+      <w:r>
+        <w:rPr>
+          <w:rFonts w:ascii="Segoe UI" w:eastAsia="宋体" w:hAnsi="Segoe UI" w:cs="Segoe UI"/>
+          <w:color w:val="CCCCCC"/>
+          <w:kern w:val="0"/>
+          <w:sz w:val="20"/>
+          <w:szCs w:val="20"/>
+        </w:rPr>
+        <w:t>（好友系统）、隐私保护位置搜索。</w:t>
+      </w:r>
+    </w:p>
+    <w:p>
+      <w:pPr>
+        <w:widowControl/>
+        <w:numPr>
+          <w:ilvl w:val="0"/>
+          <w:numId w:val="2"/>
+        </w:numPr>
+        <w:pBdr>
+          <w:top w:val="single" w:sz="2" w:space="0" w:color="E5E7EB"/>
+          <w:left w:val="single" w:sz="2" w:space="0" w:color="E5E7EB"/>
+          <w:bottom w:val="single" w:sz="2" w:space="0" w:color="E5E7EB"/>
+          <w:right w:val="single" w:sz="2" w:space="0" w:color="E5E7EB"/>
+        </w:pBdr>
+        <w:shd w:val="clear" w:color="auto" w:fill="252526"/>
+        <w:spacing w:before="100" w:beforeAutospacing="1" w:after="100" w:afterAutospacing="1"/>
+        <w:jc w:val="left"/>
+        <w:rPr>
+          <w:rFonts w:ascii="Segoe UI" w:eastAsia="宋体" w:hAnsi="Segoe UI" w:cs="Segoe UI"/>
+          <w:color w:val="CCCCCC"/>
+          <w:kern w:val="0"/>
+          <w:sz w:val="20"/>
+          <w:szCs w:val="20"/>
+        </w:rPr>
+      </w:pPr>
+      <w:r>
+        <w:rPr>
+          <w:rFonts w:ascii="Segoe UI" w:eastAsia="宋体" w:hAnsi="Segoe UI" w:cs="Segoe UI"/>
+          <w:b/>
+          <w:bCs/>
+          <w:color w:val="CCCCCC"/>
+          <w:kern w:val="0"/>
+          <w:sz w:val="20"/>
+          <w:szCs w:val="20"/>
+          <w:bdr w:val="single" w:sz="2" w:space="0" w:color="E5E7EB" w:frame="1"/>
+        </w:rPr>
+        <w:t>设计风格</w:t>
+      </w:r>
+      <w:r>
+        <w:rPr>
+          <w:rFonts w:ascii="Segoe UI" w:eastAsia="宋体" w:hAnsi="Segoe UI" w:cs="Segoe UI"/>
+          <w:color w:val="CCCCCC"/>
+          <w:kern w:val="0"/>
+          <w:sz w:val="20"/>
+          <w:szCs w:val="20"/>
+        </w:rPr>
+        <w:t>：极简</w:t>
+      </w:r>
+      <w:r>
+        <w:rPr>
+          <w:rFonts w:ascii="Segoe UI" w:eastAsia="宋体" w:hAnsi="Segoe UI" w:cs="Segoe UI"/>
+          <w:color w:val="CCCCCC"/>
+          <w:kern w:val="0"/>
+          <w:sz w:val="20"/>
+          <w:szCs w:val="20"/>
+        </w:rPr>
+        <w:t xml:space="preserve"> iOS </w:t>
+      </w:r>
+      <w:r>
+        <w:rPr>
+          <w:rFonts w:ascii="Segoe UI" w:eastAsia="宋体" w:hAnsi="Segoe UI" w:cs="Segoe UI"/>
+          <w:color w:val="CCCCCC"/>
+          <w:kern w:val="0"/>
+          <w:sz w:val="20"/>
+          <w:szCs w:val="20"/>
+        </w:rPr>
+        <w:t>原生风格，使用</w:t>
+      </w:r>
+      <w:r>
+        <w:rPr>
+          <w:rFonts w:ascii="Segoe UI" w:eastAsia="宋体" w:hAnsi="Segoe UI" w:cs="Segoe UI"/>
+          <w:color w:val="CCCCCC"/>
+          <w:kern w:val="0"/>
+          <w:sz w:val="20"/>
+          <w:szCs w:val="20"/>
+        </w:rPr>
+        <w:t> </w:t>
+      </w:r>
+      <w:r>
+        <w:rPr>
+          <w:rFonts w:ascii="Consolas" w:eastAsia="宋体" w:hAnsi="Consolas" w:cs="宋体"/>
+          <w:color w:val="D0D0D0"/>
+          <w:kern w:val="0"/>
+          <w:sz w:val="18"/>
+          <w:szCs w:val="18"/>
+          <w:bdr w:val="single" w:sz="2" w:space="0" w:color="E5E7EB" w:frame="1"/>
+          <w:shd w:val="clear" w:color="auto" w:fill="3C3C3C"/>
+        </w:rPr>
+        <w:t>CustomModal</w:t>
+      </w:r>
+      <w:r>
+        <w:rPr>
+          <w:rFonts w:ascii="Segoe UI" w:eastAsia="宋体" w:hAnsi="Segoe UI" w:cs="Segoe UI"/>
+          <w:color w:val="CCCCCC"/>
+          <w:kern w:val="0"/>
+          <w:sz w:val="20"/>
+          <w:szCs w:val="20"/>
+        </w:rPr>
+        <w:t> </w:t>
+      </w:r>
+      <w:r>
+        <w:rPr>
+          <w:rFonts w:ascii="Segoe UI" w:eastAsia="宋体" w:hAnsi="Segoe UI" w:cs="Segoe UI"/>
+          <w:color w:val="CCCCCC"/>
+          <w:kern w:val="0"/>
+          <w:sz w:val="20"/>
+          <w:szCs w:val="20"/>
+        </w:rPr>
+        <w:t>替代原生</w:t>
+      </w:r>
+      <w:r>
+        <w:rPr>
+          <w:rFonts w:ascii="Segoe UI" w:eastAsia="宋体" w:hAnsi="Segoe UI" w:cs="Segoe UI"/>
+          <w:color w:val="CCCCCC"/>
+          <w:kern w:val="0"/>
+          <w:sz w:val="20"/>
+          <w:szCs w:val="20"/>
+        </w:rPr>
+        <w:t> </w:t>
+      </w:r>
+      <w:r>
+        <w:rPr>
+          <w:rFonts w:ascii="Consolas" w:eastAsia="宋体" w:hAnsi="Consolas" w:cs="宋体"/>
+          <w:color w:val="D0D0D0"/>
+          <w:kern w:val="0"/>
+          <w:sz w:val="18"/>
+          <w:szCs w:val="18"/>
+          <w:bdr w:val="single" w:sz="2" w:space="0" w:color="E5E7EB" w:frame="1"/>
+          <w:shd w:val="clear" w:color="auto" w:fill="3C3C3C"/>
+        </w:rPr>
+        <w:t>alert</w:t>
+      </w:r>
+      <w:r>
+        <w:rPr>
+          <w:rFonts w:ascii="Segoe UI" w:eastAsia="宋体" w:hAnsi="Segoe UI" w:cs="Segoe UI"/>
+          <w:color w:val="CCCCCC"/>
+          <w:kern w:val="0"/>
+          <w:sz w:val="20"/>
+          <w:szCs w:val="20"/>
+        </w:rPr>
+        <w:t>，支持深色模式。</w:t>
       </w:r>
     </w:p>
     <w:p>
@@ -172,6 +430,916 @@
           <w:bottom w:val="single" w:sz="2" w:space="0" w:color="E5E7EB"/>
           <w:right w:val="single" w:sz="2" w:space="0" w:color="E5E7EB"/>
         </w:pBdr>
+        <w:shd w:val="clear" w:color="auto" w:fill="252526"/>
+        <w:jc w:val="left"/>
+        <w:rPr>
+          <w:rFonts w:ascii="Segoe UI" w:eastAsia="宋体" w:hAnsi="Segoe UI" w:cs="Segoe UI"/>
+          <w:color w:val="CCCCCC"/>
+          <w:kern w:val="0"/>
+          <w:sz w:val="20"/>
+          <w:szCs w:val="20"/>
+        </w:rPr>
+      </w:pPr>
+      <w:r>
+        <w:rPr>
+          <w:rFonts w:ascii="Segoe UI" w:eastAsia="宋体" w:hAnsi="Segoe UI" w:cs="Segoe UI"/>
+          <w:b/>
+          <w:bCs/>
+          <w:color w:val="CCCCCC"/>
+          <w:kern w:val="0"/>
+          <w:sz w:val="20"/>
+          <w:szCs w:val="20"/>
+          <w:bdr w:val="single" w:sz="2" w:space="0" w:color="E5E7EB" w:frame="1"/>
+        </w:rPr>
+        <w:t xml:space="preserve">2. </w:t>
+      </w:r>
+      <w:r>
+        <w:rPr>
+          <w:rFonts w:ascii="Segoe UI" w:eastAsia="宋体" w:hAnsi="Segoe UI" w:cs="Segoe UI"/>
+          <w:b/>
+          <w:bCs/>
+          <w:color w:val="CCCCCC"/>
+          <w:kern w:val="0"/>
+          <w:sz w:val="20"/>
+          <w:szCs w:val="20"/>
+          <w:bdr w:val="single" w:sz="2" w:space="0" w:color="E5E7EB" w:frame="1"/>
+        </w:rPr>
+        <w:t>目前技术栈</w:t>
+      </w:r>
+      <w:r>
+        <w:rPr>
+          <w:rFonts w:ascii="Segoe UI" w:eastAsia="宋体" w:hAnsi="Segoe UI" w:cs="Segoe UI"/>
+          <w:b/>
+          <w:bCs/>
+          <w:color w:val="CCCCCC"/>
+          <w:kern w:val="0"/>
+          <w:sz w:val="20"/>
+          <w:szCs w:val="20"/>
+          <w:bdr w:val="single" w:sz="2" w:space="0" w:color="E5E7EB" w:frame="1"/>
+        </w:rPr>
+        <w:t xml:space="preserve"> (Tech Stack)</w:t>
+      </w:r>
+    </w:p>
+    <w:p>
+      <w:pPr>
+        <w:widowControl/>
+        <w:numPr>
+          <w:ilvl w:val="0"/>
+          <w:numId w:val="3"/>
+        </w:numPr>
+        <w:pBdr>
+          <w:top w:val="single" w:sz="2" w:space="0" w:color="E5E7EB"/>
+          <w:left w:val="single" w:sz="2" w:space="0" w:color="E5E7EB"/>
+          <w:bottom w:val="single" w:sz="2" w:space="0" w:color="E5E7EB"/>
+          <w:right w:val="single" w:sz="2" w:space="0" w:color="E5E7EB"/>
+        </w:pBdr>
+        <w:shd w:val="clear" w:color="auto" w:fill="252526"/>
+        <w:spacing w:before="100" w:beforeAutospacing="1" w:after="100" w:afterAutospacing="1"/>
+        <w:jc w:val="left"/>
+        <w:rPr>
+          <w:rFonts w:ascii="Segoe UI" w:eastAsia="宋体" w:hAnsi="Segoe UI" w:cs="Segoe UI"/>
+          <w:color w:val="CCCCCC"/>
+          <w:kern w:val="0"/>
+          <w:sz w:val="20"/>
+          <w:szCs w:val="20"/>
+        </w:rPr>
+      </w:pPr>
+      <w:r>
+        <w:rPr>
+          <w:rFonts w:ascii="Segoe UI" w:eastAsia="宋体" w:hAnsi="Segoe UI" w:cs="Segoe UI"/>
+          <w:b/>
+          <w:bCs/>
+          <w:color w:val="CCCCCC"/>
+          <w:kern w:val="0"/>
+          <w:sz w:val="20"/>
+          <w:szCs w:val="20"/>
+          <w:bdr w:val="single" w:sz="2" w:space="0" w:color="E5E7EB" w:frame="1"/>
+        </w:rPr>
+        <w:t>前端</w:t>
+      </w:r>
+      <w:r>
+        <w:rPr>
+          <w:rFonts w:ascii="Segoe UI" w:eastAsia="宋体" w:hAnsi="Segoe UI" w:cs="Segoe UI"/>
+          <w:color w:val="CCCCCC"/>
+          <w:kern w:val="0"/>
+          <w:sz w:val="20"/>
+          <w:szCs w:val="20"/>
+        </w:rPr>
+        <w:t>：</w:t>
+      </w:r>
+      <w:r>
+        <w:rPr>
+          <w:rFonts w:ascii="Segoe UI" w:eastAsia="宋体" w:hAnsi="Segoe UI" w:cs="Segoe UI"/>
+          <w:color w:val="CCCCCC"/>
+          <w:kern w:val="0"/>
+          <w:sz w:val="20"/>
+          <w:szCs w:val="20"/>
+        </w:rPr>
+        <w:t>React + TypeScript + TailwindCSS + Lucide Icons</w:t>
+      </w:r>
+      <w:r>
+        <w:rPr>
+          <w:rFonts w:ascii="Segoe UI" w:eastAsia="宋体" w:hAnsi="Segoe UI" w:cs="Segoe UI"/>
+          <w:color w:val="CCCCCC"/>
+          <w:kern w:val="0"/>
+          <w:sz w:val="20"/>
+          <w:szCs w:val="20"/>
+        </w:rPr>
+        <w:t>。</w:t>
+      </w:r>
+    </w:p>
+    <w:p>
+      <w:pPr>
+        <w:widowControl/>
+        <w:numPr>
+          <w:ilvl w:val="0"/>
+          <w:numId w:val="3"/>
+        </w:numPr>
+        <w:pBdr>
+          <w:top w:val="single" w:sz="2" w:space="0" w:color="E5E7EB"/>
+          <w:left w:val="single" w:sz="2" w:space="0" w:color="E5E7EB"/>
+          <w:bottom w:val="single" w:sz="2" w:space="0" w:color="E5E7EB"/>
+          <w:right w:val="single" w:sz="2" w:space="0" w:color="E5E7EB"/>
+        </w:pBdr>
+        <w:shd w:val="clear" w:color="auto" w:fill="252526"/>
+        <w:spacing w:before="100" w:beforeAutospacing="1" w:after="100" w:afterAutospacing="1"/>
+        <w:jc w:val="left"/>
+        <w:rPr>
+          <w:rFonts w:ascii="Segoe UI" w:eastAsia="宋体" w:hAnsi="Segoe UI" w:cs="Segoe UI"/>
+          <w:color w:val="CCCCCC"/>
+          <w:kern w:val="0"/>
+          <w:sz w:val="20"/>
+          <w:szCs w:val="20"/>
+        </w:rPr>
+      </w:pPr>
+      <w:r>
+        <w:rPr>
+          <w:rFonts w:ascii="Segoe UI" w:eastAsia="宋体" w:hAnsi="Segoe UI" w:cs="Segoe UI"/>
+          <w:b/>
+          <w:bCs/>
+          <w:color w:val="CCCCCC"/>
+          <w:kern w:val="0"/>
+          <w:sz w:val="20"/>
+          <w:szCs w:val="20"/>
+          <w:bdr w:val="single" w:sz="2" w:space="0" w:color="E5E7EB" w:frame="1"/>
+        </w:rPr>
+        <w:t>后端</w:t>
+      </w:r>
+      <w:r>
+        <w:rPr>
+          <w:rFonts w:ascii="Segoe UI" w:eastAsia="宋体" w:hAnsi="Segoe UI" w:cs="Segoe UI"/>
+          <w:color w:val="CCCCCC"/>
+          <w:kern w:val="0"/>
+          <w:sz w:val="20"/>
+          <w:szCs w:val="20"/>
+        </w:rPr>
+        <w:t>：</w:t>
+      </w:r>
+      <w:r>
+        <w:rPr>
+          <w:rFonts w:ascii="Segoe UI" w:eastAsia="宋体" w:hAnsi="Segoe UI" w:cs="Segoe UI"/>
+          <w:color w:val="CCCCCC"/>
+          <w:kern w:val="0"/>
+          <w:sz w:val="20"/>
+          <w:szCs w:val="20"/>
+        </w:rPr>
+        <w:t>Python (FastAPI) + SQLAlchemy (Async) + SQLite (aiosqlite) + Pydantic</w:t>
+      </w:r>
+      <w:r>
+        <w:rPr>
+          <w:rFonts w:ascii="Segoe UI" w:eastAsia="宋体" w:hAnsi="Segoe UI" w:cs="Segoe UI"/>
+          <w:color w:val="CCCCCC"/>
+          <w:kern w:val="0"/>
+          <w:sz w:val="20"/>
+          <w:szCs w:val="20"/>
+        </w:rPr>
+        <w:t>。</w:t>
+      </w:r>
+    </w:p>
+    <w:p>
+      <w:pPr>
+        <w:widowControl/>
+        <w:numPr>
+          <w:ilvl w:val="0"/>
+          <w:numId w:val="3"/>
+        </w:numPr>
+        <w:pBdr>
+          <w:top w:val="single" w:sz="2" w:space="0" w:color="E5E7EB"/>
+          <w:left w:val="single" w:sz="2" w:space="0" w:color="E5E7EB"/>
+          <w:bottom w:val="single" w:sz="2" w:space="0" w:color="E5E7EB"/>
+          <w:right w:val="single" w:sz="2" w:space="0" w:color="E5E7EB"/>
+        </w:pBdr>
+        <w:shd w:val="clear" w:color="auto" w:fill="252526"/>
+        <w:spacing w:before="100" w:beforeAutospacing="1" w:after="100" w:afterAutospacing="1"/>
+        <w:jc w:val="left"/>
+        <w:rPr>
+          <w:rFonts w:ascii="Segoe UI" w:eastAsia="宋体" w:hAnsi="Segoe UI" w:cs="Segoe UI"/>
+          <w:color w:val="CCCCCC"/>
+          <w:kern w:val="0"/>
+          <w:sz w:val="20"/>
+          <w:szCs w:val="20"/>
+        </w:rPr>
+      </w:pPr>
+      <w:r>
+        <w:rPr>
+          <w:rFonts w:ascii="Segoe UI" w:eastAsia="宋体" w:hAnsi="Segoe UI" w:cs="Segoe UI"/>
+          <w:b/>
+          <w:bCs/>
+          <w:color w:val="CCCCCC"/>
+          <w:kern w:val="0"/>
+          <w:sz w:val="20"/>
+          <w:szCs w:val="20"/>
+          <w:bdr w:val="single" w:sz="2" w:space="0" w:color="E5E7EB" w:frame="1"/>
+        </w:rPr>
+        <w:t>部署</w:t>
+      </w:r>
+      <w:r>
+        <w:rPr>
+          <w:rFonts w:ascii="Segoe UI" w:eastAsia="宋体" w:hAnsi="Segoe UI" w:cs="Segoe UI"/>
+          <w:color w:val="CCCCCC"/>
+          <w:kern w:val="0"/>
+          <w:sz w:val="20"/>
+          <w:szCs w:val="20"/>
+        </w:rPr>
+        <w:t>：支持本地</w:t>
+      </w:r>
+      <w:r>
+        <w:rPr>
+          <w:rFonts w:ascii="Segoe UI" w:eastAsia="宋体" w:hAnsi="Segoe UI" w:cs="Segoe UI"/>
+          <w:color w:val="CCCCCC"/>
+          <w:kern w:val="0"/>
+          <w:sz w:val="20"/>
+          <w:szCs w:val="20"/>
+        </w:rPr>
+        <w:t xml:space="preserve"> Git </w:t>
+      </w:r>
+      <w:r>
+        <w:rPr>
+          <w:rFonts w:ascii="Segoe UI" w:eastAsia="宋体" w:hAnsi="Segoe UI" w:cs="Segoe UI"/>
+          <w:color w:val="CCCCCC"/>
+          <w:kern w:val="0"/>
+          <w:sz w:val="20"/>
+          <w:szCs w:val="20"/>
+        </w:rPr>
+        <w:t>版本管理、</w:t>
+      </w:r>
+      <w:r>
+        <w:rPr>
+          <w:rFonts w:ascii="Segoe UI" w:eastAsia="宋体" w:hAnsi="Segoe UI" w:cs="Segoe UI"/>
+          <w:color w:val="CCCCCC"/>
+          <w:kern w:val="0"/>
+          <w:sz w:val="20"/>
+          <w:szCs w:val="20"/>
+        </w:rPr>
+        <w:t xml:space="preserve">Docker </w:t>
+      </w:r>
+      <w:r>
+        <w:rPr>
+          <w:rFonts w:ascii="Segoe UI" w:eastAsia="宋体" w:hAnsi="Segoe UI" w:cs="Segoe UI"/>
+          <w:color w:val="CCCCCC"/>
+          <w:kern w:val="0"/>
+          <w:sz w:val="20"/>
+          <w:szCs w:val="20"/>
+        </w:rPr>
+        <w:t>容器化部署。</w:t>
+      </w:r>
+    </w:p>
+    <w:p>
+      <w:pPr>
+        <w:widowControl/>
+        <w:pBdr>
+          <w:top w:val="single" w:sz="2" w:space="0" w:color="E5E7EB"/>
+          <w:left w:val="single" w:sz="2" w:space="0" w:color="E5E7EB"/>
+          <w:bottom w:val="single" w:sz="2" w:space="0" w:color="E5E7EB"/>
+          <w:right w:val="single" w:sz="2" w:space="0" w:color="E5E7EB"/>
+        </w:pBdr>
+        <w:shd w:val="clear" w:color="auto" w:fill="252526"/>
+        <w:jc w:val="left"/>
+        <w:rPr>
+          <w:rFonts w:ascii="Segoe UI" w:eastAsia="宋体" w:hAnsi="Segoe UI" w:cs="Segoe UI"/>
+          <w:color w:val="CCCCCC"/>
+          <w:kern w:val="0"/>
+          <w:sz w:val="20"/>
+          <w:szCs w:val="20"/>
+        </w:rPr>
+      </w:pPr>
+      <w:r>
+        <w:rPr>
+          <w:rFonts w:ascii="Segoe UI" w:eastAsia="宋体" w:hAnsi="Segoe UI" w:cs="Segoe UI"/>
+          <w:b/>
+          <w:bCs/>
+          <w:color w:val="CCCCCC"/>
+          <w:kern w:val="0"/>
+          <w:sz w:val="20"/>
+          <w:szCs w:val="20"/>
+          <w:bdr w:val="single" w:sz="2" w:space="0" w:color="E5E7EB" w:frame="1"/>
+        </w:rPr>
+        <w:t xml:space="preserve">3. </w:t>
+      </w:r>
+      <w:r>
+        <w:rPr>
+          <w:rFonts w:ascii="Segoe UI" w:eastAsia="宋体" w:hAnsi="Segoe UI" w:cs="Segoe UI"/>
+          <w:b/>
+          <w:bCs/>
+          <w:color w:val="CCCCCC"/>
+          <w:kern w:val="0"/>
+          <w:sz w:val="20"/>
+          <w:szCs w:val="20"/>
+          <w:bdr w:val="single" w:sz="2" w:space="0" w:color="E5E7EB" w:frame="1"/>
+        </w:rPr>
+        <w:t>最近完成的工作进展</w:t>
+      </w:r>
+      <w:r>
+        <w:rPr>
+          <w:rFonts w:ascii="Segoe UI" w:eastAsia="宋体" w:hAnsi="Segoe UI" w:cs="Segoe UI"/>
+          <w:b/>
+          <w:bCs/>
+          <w:color w:val="CCCCCC"/>
+          <w:kern w:val="0"/>
+          <w:sz w:val="20"/>
+          <w:szCs w:val="20"/>
+          <w:bdr w:val="single" w:sz="2" w:space="0" w:color="E5E7EB" w:frame="1"/>
+        </w:rPr>
+        <w:t xml:space="preserve"> (Recent Progress)</w:t>
+      </w:r>
+    </w:p>
+    <w:p>
+      <w:pPr>
+        <w:widowControl/>
+        <w:numPr>
+          <w:ilvl w:val="0"/>
+          <w:numId w:val="4"/>
+        </w:numPr>
+        <w:pBdr>
+          <w:top w:val="single" w:sz="2" w:space="0" w:color="E5E7EB"/>
+          <w:left w:val="single" w:sz="2" w:space="0" w:color="E5E7EB"/>
+          <w:bottom w:val="single" w:sz="2" w:space="0" w:color="E5E7EB"/>
+          <w:right w:val="single" w:sz="2" w:space="0" w:color="E5E7EB"/>
+        </w:pBdr>
+        <w:shd w:val="clear" w:color="auto" w:fill="252526"/>
+        <w:spacing w:before="100" w:beforeAutospacing="1" w:after="100" w:afterAutospacing="1"/>
+        <w:jc w:val="left"/>
+        <w:rPr>
+          <w:rFonts w:ascii="Segoe UI" w:eastAsia="宋体" w:hAnsi="Segoe UI" w:cs="Segoe UI"/>
+          <w:color w:val="CCCCCC"/>
+          <w:kern w:val="0"/>
+          <w:sz w:val="20"/>
+          <w:szCs w:val="20"/>
+        </w:rPr>
+      </w:pPr>
+      <w:r>
+        <w:rPr>
+          <w:rFonts w:ascii="Segoe UI" w:eastAsia="宋体" w:hAnsi="Segoe UI" w:cs="Segoe UI"/>
+          <w:b/>
+          <w:bCs/>
+          <w:color w:val="CCCCCC"/>
+          <w:kern w:val="0"/>
+          <w:sz w:val="20"/>
+          <w:szCs w:val="20"/>
+          <w:bdr w:val="single" w:sz="2" w:space="0" w:color="E5E7EB" w:frame="1"/>
+        </w:rPr>
+        <w:t>社交功能重构</w:t>
+      </w:r>
+      <w:r>
+        <w:rPr>
+          <w:rFonts w:ascii="Segoe UI" w:eastAsia="宋体" w:hAnsi="Segoe UI" w:cs="Segoe UI"/>
+          <w:color w:val="CCCCCC"/>
+          <w:kern w:val="0"/>
+          <w:sz w:val="20"/>
+          <w:szCs w:val="20"/>
+        </w:rPr>
+        <w:t>：</w:t>
+      </w:r>
+    </w:p>
+    <w:p>
+      <w:pPr>
+        <w:widowControl/>
+        <w:numPr>
+          <w:ilvl w:val="1"/>
+          <w:numId w:val="4"/>
+        </w:numPr>
+        <w:pBdr>
+          <w:top w:val="single" w:sz="2" w:space="0" w:color="E5E7EB"/>
+          <w:left w:val="single" w:sz="2" w:space="0" w:color="E5E7EB"/>
+          <w:bottom w:val="single" w:sz="2" w:space="0" w:color="E5E7EB"/>
+          <w:right w:val="single" w:sz="2" w:space="0" w:color="E5E7EB"/>
+        </w:pBdr>
+        <w:shd w:val="clear" w:color="auto" w:fill="252526"/>
+        <w:spacing w:before="100" w:beforeAutospacing="1" w:after="100" w:afterAutospacing="1"/>
+        <w:jc w:val="left"/>
+        <w:rPr>
+          <w:rFonts w:ascii="Segoe UI" w:eastAsia="宋体" w:hAnsi="Segoe UI" w:cs="Segoe UI"/>
+          <w:color w:val="CCCCCC"/>
+          <w:kern w:val="0"/>
+          <w:sz w:val="20"/>
+          <w:szCs w:val="20"/>
+        </w:rPr>
+      </w:pPr>
+      <w:r>
+        <w:rPr>
+          <w:rFonts w:ascii="Segoe UI" w:eastAsia="宋体" w:hAnsi="Segoe UI" w:cs="Segoe UI"/>
+          <w:b/>
+          <w:bCs/>
+          <w:color w:val="CCCCCC"/>
+          <w:kern w:val="0"/>
+          <w:sz w:val="20"/>
+          <w:szCs w:val="20"/>
+          <w:bdr w:val="single" w:sz="2" w:space="0" w:color="E5E7EB" w:frame="1"/>
+        </w:rPr>
+        <w:t>好友删除</w:t>
+      </w:r>
+      <w:r>
+        <w:rPr>
+          <w:rFonts w:ascii="Segoe UI" w:eastAsia="宋体" w:hAnsi="Segoe UI" w:cs="Segoe UI"/>
+          <w:b/>
+          <w:bCs/>
+          <w:color w:val="CCCCCC"/>
+          <w:kern w:val="0"/>
+          <w:sz w:val="20"/>
+          <w:szCs w:val="20"/>
+          <w:bdr w:val="single" w:sz="2" w:space="0" w:color="E5E7EB" w:frame="1"/>
+        </w:rPr>
+        <w:t xml:space="preserve"> vs </w:t>
+      </w:r>
+      <w:r>
+        <w:rPr>
+          <w:rFonts w:ascii="Segoe UI" w:eastAsia="宋体" w:hAnsi="Segoe UI" w:cs="Segoe UI"/>
+          <w:b/>
+          <w:bCs/>
+          <w:color w:val="CCCCCC"/>
+          <w:kern w:val="0"/>
+          <w:sz w:val="20"/>
+          <w:szCs w:val="20"/>
+          <w:bdr w:val="single" w:sz="2" w:space="0" w:color="E5E7EB" w:frame="1"/>
+        </w:rPr>
+        <w:t>拉黑</w:t>
+      </w:r>
+      <w:r>
+        <w:rPr>
+          <w:rFonts w:ascii="Segoe UI" w:eastAsia="宋体" w:hAnsi="Segoe UI" w:cs="Segoe UI"/>
+          <w:color w:val="CCCCCC"/>
+          <w:kern w:val="0"/>
+          <w:sz w:val="20"/>
+          <w:szCs w:val="20"/>
+        </w:rPr>
+        <w:t>：实现了逻辑分离。删除仅解除好友关系；拉黑（</w:t>
+      </w:r>
+      <w:r>
+        <w:rPr>
+          <w:rFonts w:ascii="Segoe UI" w:eastAsia="宋体" w:hAnsi="Segoe UI" w:cs="Segoe UI"/>
+          <w:color w:val="CCCCCC"/>
+          <w:kern w:val="0"/>
+          <w:sz w:val="20"/>
+          <w:szCs w:val="20"/>
+        </w:rPr>
+        <w:t>Block</w:t>
+      </w:r>
+      <w:r>
+        <w:rPr>
+          <w:rFonts w:ascii="Segoe UI" w:eastAsia="宋体" w:hAnsi="Segoe UI" w:cs="Segoe UI"/>
+          <w:color w:val="CCCCCC"/>
+          <w:kern w:val="0"/>
+          <w:sz w:val="20"/>
+          <w:szCs w:val="20"/>
+        </w:rPr>
+        <w:t>）则通过后端过滤，使双方在搜索结果中互相不可见，且无法重新添加。</w:t>
+      </w:r>
+    </w:p>
+    <w:p>
+      <w:pPr>
+        <w:widowControl/>
+        <w:numPr>
+          <w:ilvl w:val="1"/>
+          <w:numId w:val="4"/>
+        </w:numPr>
+        <w:pBdr>
+          <w:top w:val="single" w:sz="2" w:space="0" w:color="E5E7EB"/>
+          <w:left w:val="single" w:sz="2" w:space="0" w:color="E5E7EB"/>
+          <w:bottom w:val="single" w:sz="2" w:space="0" w:color="E5E7EB"/>
+          <w:right w:val="single" w:sz="2" w:space="0" w:color="E5E7EB"/>
+        </w:pBdr>
+        <w:shd w:val="clear" w:color="auto" w:fill="252526"/>
+        <w:spacing w:before="100" w:beforeAutospacing="1" w:after="100" w:afterAutospacing="1"/>
+        <w:jc w:val="left"/>
+        <w:rPr>
+          <w:rFonts w:ascii="Segoe UI" w:eastAsia="宋体" w:hAnsi="Segoe UI" w:cs="Segoe UI"/>
+          <w:color w:val="CCCCCC"/>
+          <w:kern w:val="0"/>
+          <w:sz w:val="20"/>
+          <w:szCs w:val="20"/>
+        </w:rPr>
+      </w:pPr>
+      <w:r>
+        <w:rPr>
+          <w:rFonts w:ascii="Segoe UI" w:eastAsia="宋体" w:hAnsi="Segoe UI" w:cs="Segoe UI"/>
+          <w:b/>
+          <w:bCs/>
+          <w:color w:val="CCCCCC"/>
+          <w:kern w:val="0"/>
+          <w:sz w:val="20"/>
+          <w:szCs w:val="20"/>
+          <w:bdr w:val="single" w:sz="2" w:space="0" w:color="E5E7EB" w:frame="1"/>
+        </w:rPr>
+        <w:t>隐私位置搜索</w:t>
+      </w:r>
+      <w:r>
+        <w:rPr>
+          <w:rFonts w:ascii="Segoe UI" w:eastAsia="宋体" w:hAnsi="Segoe UI" w:cs="Segoe UI"/>
+          <w:color w:val="CCCCCC"/>
+          <w:kern w:val="0"/>
+          <w:sz w:val="20"/>
+          <w:szCs w:val="20"/>
+        </w:rPr>
+        <w:t>：后端支持经纬度（</w:t>
+      </w:r>
+      <w:r>
+        <w:rPr>
+          <w:rFonts w:ascii="Segoe UI" w:eastAsia="宋体" w:hAnsi="Segoe UI" w:cs="Segoe UI"/>
+          <w:color w:val="CCCCCC"/>
+          <w:kern w:val="0"/>
+          <w:sz w:val="20"/>
+          <w:szCs w:val="20"/>
+        </w:rPr>
+        <w:t>GPS</w:t>
+      </w:r>
+      <w:r>
+        <w:rPr>
+          <w:rFonts w:ascii="Segoe UI" w:eastAsia="宋体" w:hAnsi="Segoe UI" w:cs="Segoe UI"/>
+          <w:color w:val="CCCCCC"/>
+          <w:kern w:val="0"/>
+          <w:sz w:val="20"/>
+          <w:szCs w:val="20"/>
+        </w:rPr>
+        <w:t>）计算距离并自动排序，但前端</w:t>
+      </w:r>
+      <w:r>
+        <w:rPr>
+          <w:rFonts w:ascii="Segoe UI" w:eastAsia="宋体" w:hAnsi="Segoe UI" w:cs="Segoe UI"/>
+          <w:color w:val="CCCCCC"/>
+          <w:kern w:val="0"/>
+          <w:sz w:val="20"/>
+          <w:szCs w:val="20"/>
+        </w:rPr>
+        <w:t xml:space="preserve"> API </w:t>
+      </w:r>
+      <w:r>
+        <w:rPr>
+          <w:rFonts w:ascii="Segoe UI" w:eastAsia="宋体" w:hAnsi="Segoe UI" w:cs="Segoe UI"/>
+          <w:color w:val="CCCCCC"/>
+          <w:kern w:val="0"/>
+          <w:sz w:val="20"/>
+          <w:szCs w:val="20"/>
+        </w:rPr>
+        <w:t>严格脱敏，仅展示</w:t>
+      </w:r>
+      <w:r>
+        <w:rPr>
+          <w:rFonts w:ascii="Segoe UI" w:eastAsia="宋体" w:hAnsi="Segoe UI" w:cs="Segoe UI"/>
+          <w:color w:val="CCCCCC"/>
+          <w:kern w:val="0"/>
+          <w:sz w:val="20"/>
+          <w:szCs w:val="20"/>
+        </w:rPr>
+        <w:t>“</w:t>
+      </w:r>
+      <w:r>
+        <w:rPr>
+          <w:rFonts w:ascii="Segoe UI" w:eastAsia="宋体" w:hAnsi="Segoe UI" w:cs="Segoe UI"/>
+          <w:color w:val="CCCCCC"/>
+          <w:kern w:val="0"/>
+          <w:sz w:val="20"/>
+          <w:szCs w:val="20"/>
+        </w:rPr>
+        <w:t>城市</w:t>
+      </w:r>
+      <w:r>
+        <w:rPr>
+          <w:rFonts w:ascii="Segoe UI" w:eastAsia="宋体" w:hAnsi="Segoe UI" w:cs="Segoe UI"/>
+          <w:color w:val="CCCCCC"/>
+          <w:kern w:val="0"/>
+          <w:sz w:val="20"/>
+          <w:szCs w:val="20"/>
+        </w:rPr>
+        <w:t>”</w:t>
+      </w:r>
+      <w:r>
+        <w:rPr>
+          <w:rFonts w:ascii="Segoe UI" w:eastAsia="宋体" w:hAnsi="Segoe UI" w:cs="Segoe UI"/>
+          <w:color w:val="CCCCCC"/>
+          <w:kern w:val="0"/>
+          <w:sz w:val="20"/>
+          <w:szCs w:val="20"/>
+        </w:rPr>
+        <w:t>信息。</w:t>
+      </w:r>
+    </w:p>
+    <w:p>
+      <w:pPr>
+        <w:widowControl/>
+        <w:numPr>
+          <w:ilvl w:val="1"/>
+          <w:numId w:val="4"/>
+        </w:numPr>
+        <w:pBdr>
+          <w:top w:val="single" w:sz="2" w:space="0" w:color="E5E7EB"/>
+          <w:left w:val="single" w:sz="2" w:space="0" w:color="E5E7EB"/>
+          <w:bottom w:val="single" w:sz="2" w:space="0" w:color="E5E7EB"/>
+          <w:right w:val="single" w:sz="2" w:space="0" w:color="E5E7EB"/>
+        </w:pBdr>
+        <w:shd w:val="clear" w:color="auto" w:fill="252526"/>
+        <w:spacing w:before="100" w:beforeAutospacing="1" w:after="100" w:afterAutospacing="1"/>
+        <w:jc w:val="left"/>
+        <w:rPr>
+          <w:rFonts w:ascii="Segoe UI" w:eastAsia="宋体" w:hAnsi="Segoe UI" w:cs="Segoe UI"/>
+          <w:color w:val="CCCCCC"/>
+          <w:kern w:val="0"/>
+          <w:sz w:val="20"/>
+          <w:szCs w:val="20"/>
+        </w:rPr>
+      </w:pPr>
+      <w:r>
+        <w:rPr>
+          <w:rFonts w:ascii="Segoe UI" w:eastAsia="宋体" w:hAnsi="Segoe UI" w:cs="Segoe UI"/>
+          <w:b/>
+          <w:bCs/>
+          <w:color w:val="CCCCCC"/>
+          <w:kern w:val="0"/>
+          <w:sz w:val="20"/>
+          <w:szCs w:val="20"/>
+          <w:bdr w:val="single" w:sz="2" w:space="0" w:color="E5E7EB" w:frame="1"/>
+        </w:rPr>
+        <w:t>个人资料卡片</w:t>
+      </w:r>
+      <w:r>
+        <w:rPr>
+          <w:rFonts w:ascii="Segoe UI" w:eastAsia="宋体" w:hAnsi="Segoe UI" w:cs="Segoe UI"/>
+          <w:b/>
+          <w:bCs/>
+          <w:color w:val="CCCCCC"/>
+          <w:kern w:val="0"/>
+          <w:sz w:val="20"/>
+          <w:szCs w:val="20"/>
+          <w:bdr w:val="single" w:sz="2" w:space="0" w:color="E5E7EB" w:frame="1"/>
+        </w:rPr>
+        <w:t xml:space="preserve"> (ProfileModal)</w:t>
+      </w:r>
+      <w:r>
+        <w:rPr>
+          <w:rFonts w:ascii="Segoe UI" w:eastAsia="宋体" w:hAnsi="Segoe UI" w:cs="Segoe UI"/>
+          <w:color w:val="CCCCCC"/>
+          <w:kern w:val="0"/>
+          <w:sz w:val="20"/>
+          <w:szCs w:val="20"/>
+        </w:rPr>
+        <w:t>：点击头像可查看包含专注时长、勋章数（</w:t>
+      </w:r>
+      <w:r>
+        <w:rPr>
+          <w:rFonts w:ascii="Segoe UI" w:eastAsia="宋体" w:hAnsi="Segoe UI" w:cs="Segoe UI"/>
+          <w:color w:val="CCCCCC"/>
+          <w:kern w:val="0"/>
+          <w:sz w:val="20"/>
+          <w:szCs w:val="20"/>
+        </w:rPr>
+        <w:t>Sparks</w:t>
+      </w:r>
+      <w:r>
+        <w:rPr>
+          <w:rFonts w:ascii="Segoe UI" w:eastAsia="宋体" w:hAnsi="Segoe UI" w:cs="Segoe UI"/>
+          <w:color w:val="CCCCCC"/>
+          <w:kern w:val="0"/>
+          <w:sz w:val="20"/>
+          <w:szCs w:val="20"/>
+        </w:rPr>
+        <w:t>）、个人格言的</w:t>
+      </w:r>
+      <w:r>
+        <w:rPr>
+          <w:rFonts w:ascii="Segoe UI" w:eastAsia="宋体" w:hAnsi="Segoe UI" w:cs="Segoe UI"/>
+          <w:color w:val="CCCCCC"/>
+          <w:kern w:val="0"/>
+          <w:sz w:val="20"/>
+          <w:szCs w:val="20"/>
+        </w:rPr>
+        <w:t xml:space="preserve"> iOS </w:t>
+      </w:r>
+      <w:r>
+        <w:rPr>
+          <w:rFonts w:ascii="Segoe UI" w:eastAsia="宋体" w:hAnsi="Segoe UI" w:cs="Segoe UI"/>
+          <w:color w:val="CCCCCC"/>
+          <w:kern w:val="0"/>
+          <w:sz w:val="20"/>
+          <w:szCs w:val="20"/>
+        </w:rPr>
+        <w:t>风格弹窗。</w:t>
+      </w:r>
+    </w:p>
+    <w:p>
+      <w:pPr>
+        <w:widowControl/>
+        <w:numPr>
+          <w:ilvl w:val="0"/>
+          <w:numId w:val="4"/>
+        </w:numPr>
+        <w:pBdr>
+          <w:top w:val="single" w:sz="2" w:space="0" w:color="E5E7EB"/>
+          <w:left w:val="single" w:sz="2" w:space="0" w:color="E5E7EB"/>
+          <w:bottom w:val="single" w:sz="2" w:space="0" w:color="E5E7EB"/>
+          <w:right w:val="single" w:sz="2" w:space="0" w:color="E5E7EB"/>
+        </w:pBdr>
+        <w:shd w:val="clear" w:color="auto" w:fill="252526"/>
+        <w:spacing w:before="100" w:beforeAutospacing="1" w:after="100" w:afterAutospacing="1"/>
+        <w:jc w:val="left"/>
+        <w:rPr>
+          <w:rFonts w:ascii="Segoe UI" w:eastAsia="宋体" w:hAnsi="Segoe UI" w:cs="Segoe UI"/>
+          <w:color w:val="CCCCCC"/>
+          <w:kern w:val="0"/>
+          <w:sz w:val="20"/>
+          <w:szCs w:val="20"/>
+        </w:rPr>
+      </w:pPr>
+      <w:r>
+        <w:rPr>
+          <w:rFonts w:ascii="Segoe UI" w:eastAsia="宋体" w:hAnsi="Segoe UI" w:cs="Segoe UI"/>
+          <w:b/>
+          <w:bCs/>
+          <w:color w:val="CCCCCC"/>
+          <w:kern w:val="0"/>
+          <w:sz w:val="20"/>
+          <w:szCs w:val="20"/>
+          <w:bdr w:val="single" w:sz="2" w:space="0" w:color="E5E7EB" w:frame="1"/>
+        </w:rPr>
+        <w:t>架构优化</w:t>
+      </w:r>
+      <w:r>
+        <w:rPr>
+          <w:rFonts w:ascii="Segoe UI" w:eastAsia="宋体" w:hAnsi="Segoe UI" w:cs="Segoe UI"/>
+          <w:color w:val="CCCCCC"/>
+          <w:kern w:val="0"/>
+          <w:sz w:val="20"/>
+          <w:szCs w:val="20"/>
+        </w:rPr>
+        <w:t>：</w:t>
+      </w:r>
+    </w:p>
+    <w:p>
+      <w:pPr>
+        <w:widowControl/>
+        <w:numPr>
+          <w:ilvl w:val="1"/>
+          <w:numId w:val="4"/>
+        </w:numPr>
+        <w:pBdr>
+          <w:top w:val="single" w:sz="2" w:space="0" w:color="E5E7EB"/>
+          <w:left w:val="single" w:sz="2" w:space="0" w:color="E5E7EB"/>
+          <w:bottom w:val="single" w:sz="2" w:space="0" w:color="E5E7EB"/>
+          <w:right w:val="single" w:sz="2" w:space="0" w:color="E5E7EB"/>
+        </w:pBdr>
+        <w:shd w:val="clear" w:color="auto" w:fill="252526"/>
+        <w:spacing w:before="100" w:beforeAutospacing="1" w:after="100" w:afterAutospacing="1"/>
+        <w:jc w:val="left"/>
+        <w:rPr>
+          <w:rFonts w:ascii="Segoe UI" w:eastAsia="宋体" w:hAnsi="Segoe UI" w:cs="Segoe UI"/>
+          <w:color w:val="CCCCCC"/>
+          <w:kern w:val="0"/>
+          <w:sz w:val="20"/>
+          <w:szCs w:val="20"/>
+        </w:rPr>
+      </w:pPr>
+      <w:r>
+        <w:rPr>
+          <w:rFonts w:ascii="Segoe UI" w:eastAsia="宋体" w:hAnsi="Segoe UI" w:cs="Segoe UI"/>
+          <w:color w:val="CCCCCC"/>
+          <w:kern w:val="0"/>
+          <w:sz w:val="20"/>
+          <w:szCs w:val="20"/>
+        </w:rPr>
+        <w:t>同步了数据库字段（</w:t>
+      </w:r>
+      <w:r>
+        <w:rPr>
+          <w:rFonts w:ascii="Consolas" w:eastAsia="宋体" w:hAnsi="Consolas" w:cs="宋体"/>
+          <w:color w:val="D0D0D0"/>
+          <w:kern w:val="0"/>
+          <w:sz w:val="18"/>
+          <w:szCs w:val="18"/>
+          <w:bdr w:val="single" w:sz="2" w:space="0" w:color="E5E7EB" w:frame="1"/>
+          <w:shd w:val="clear" w:color="auto" w:fill="3C3C3C"/>
+        </w:rPr>
+        <w:t>profiles</w:t>
+      </w:r>
+      <w:r>
+        <w:rPr>
+          <w:rFonts w:ascii="Segoe UI" w:eastAsia="宋体" w:hAnsi="Segoe UI" w:cs="Segoe UI"/>
+          <w:color w:val="CCCCCC"/>
+          <w:kern w:val="0"/>
+          <w:sz w:val="20"/>
+          <w:szCs w:val="20"/>
+        </w:rPr>
+        <w:t> </w:t>
+      </w:r>
+      <w:r>
+        <w:rPr>
+          <w:rFonts w:ascii="Segoe UI" w:eastAsia="宋体" w:hAnsi="Segoe UI" w:cs="Segoe UI"/>
+          <w:color w:val="CCCCCC"/>
+          <w:kern w:val="0"/>
+          <w:sz w:val="20"/>
+          <w:szCs w:val="20"/>
+        </w:rPr>
+        <w:t>表新增了</w:t>
+      </w:r>
+      <w:r>
+        <w:rPr>
+          <w:rFonts w:ascii="Segoe UI" w:eastAsia="宋体" w:hAnsi="Segoe UI" w:cs="Segoe UI"/>
+          <w:color w:val="CCCCCC"/>
+          <w:kern w:val="0"/>
+          <w:sz w:val="20"/>
+          <w:szCs w:val="20"/>
+        </w:rPr>
+        <w:t> </w:t>
+      </w:r>
+      <w:r>
+        <w:rPr>
+          <w:rFonts w:ascii="Consolas" w:eastAsia="宋体" w:hAnsi="Consolas" w:cs="宋体"/>
+          <w:color w:val="D0D0D0"/>
+          <w:kern w:val="0"/>
+          <w:sz w:val="18"/>
+          <w:szCs w:val="18"/>
+          <w:bdr w:val="single" w:sz="2" w:space="0" w:color="E5E7EB" w:frame="1"/>
+          <w:shd w:val="clear" w:color="auto" w:fill="3C3C3C"/>
+        </w:rPr>
+        <w:t>city</w:t>
+      </w:r>
+      <w:r>
+        <w:rPr>
+          <w:rFonts w:ascii="Segoe UI" w:eastAsia="宋体" w:hAnsi="Segoe UI" w:cs="Segoe UI"/>
+          <w:color w:val="CCCCCC"/>
+          <w:kern w:val="0"/>
+          <w:sz w:val="20"/>
+          <w:szCs w:val="20"/>
+        </w:rPr>
+        <w:t>, </w:t>
+      </w:r>
+      <w:r>
+        <w:rPr>
+          <w:rFonts w:ascii="Consolas" w:eastAsia="宋体" w:hAnsi="Consolas" w:cs="宋体"/>
+          <w:color w:val="D0D0D0"/>
+          <w:kern w:val="0"/>
+          <w:sz w:val="18"/>
+          <w:szCs w:val="18"/>
+          <w:bdr w:val="single" w:sz="2" w:space="0" w:color="E5E7EB" w:frame="1"/>
+          <w:shd w:val="clear" w:color="auto" w:fill="3C3C3C"/>
+        </w:rPr>
+        <w:t>latitude</w:t>
+      </w:r>
+      <w:r>
+        <w:rPr>
+          <w:rFonts w:ascii="Segoe UI" w:eastAsia="宋体" w:hAnsi="Segoe UI" w:cs="Segoe UI"/>
+          <w:color w:val="CCCCCC"/>
+          <w:kern w:val="0"/>
+          <w:sz w:val="20"/>
+          <w:szCs w:val="20"/>
+        </w:rPr>
+        <w:t>, </w:t>
+      </w:r>
+      <w:r>
+        <w:rPr>
+          <w:rFonts w:ascii="Consolas" w:eastAsia="宋体" w:hAnsi="Consolas" w:cs="宋体"/>
+          <w:color w:val="D0D0D0"/>
+          <w:kern w:val="0"/>
+          <w:sz w:val="18"/>
+          <w:szCs w:val="18"/>
+          <w:bdr w:val="single" w:sz="2" w:space="0" w:color="E5E7EB" w:frame="1"/>
+          <w:shd w:val="clear" w:color="auto" w:fill="3C3C3C"/>
+        </w:rPr>
+        <w:t>longitude</w:t>
+      </w:r>
+      <w:r>
+        <w:rPr>
+          <w:rFonts w:ascii="Segoe UI" w:eastAsia="宋体" w:hAnsi="Segoe UI" w:cs="Segoe UI"/>
+          <w:color w:val="CCCCCC"/>
+          <w:kern w:val="0"/>
+          <w:sz w:val="20"/>
+          <w:szCs w:val="20"/>
+        </w:rPr>
+        <w:t>）。</w:t>
+      </w:r>
+    </w:p>
+    <w:p>
+      <w:pPr>
+        <w:widowControl/>
+        <w:numPr>
+          <w:ilvl w:val="1"/>
+          <w:numId w:val="4"/>
+        </w:numPr>
+        <w:pBdr>
+          <w:top w:val="single" w:sz="2" w:space="0" w:color="E5E7EB"/>
+          <w:left w:val="single" w:sz="2" w:space="0" w:color="E5E7EB"/>
+          <w:bottom w:val="single" w:sz="2" w:space="0" w:color="E5E7EB"/>
+          <w:right w:val="single" w:sz="2" w:space="0" w:color="E5E7EB"/>
+        </w:pBdr>
+        <w:shd w:val="clear" w:color="auto" w:fill="252526"/>
+        <w:spacing w:before="100" w:beforeAutospacing="1" w:after="100" w:afterAutospacing="1"/>
         <w:jc w:val="left"/>
         <w:rPr>
           <w:rFonts w:ascii="宋体" w:eastAsia="宋体" w:hAnsi="宋体" w:cs="宋体"/>
@@ -184,65 +1352,12 @@
       <w:r>
         <w:rPr>
           <w:rFonts w:ascii="Segoe UI" w:eastAsia="宋体" w:hAnsi="Segoe UI" w:cs="Segoe UI"/>
-          <w:b/>
-          <w:bCs/>
-          <w:color w:val="CCCCCC"/>
-          <w:kern w:val="0"/>
-          <w:sz w:val="20"/>
-          <w:szCs w:val="20"/>
-          <w:bdr w:val="single" w:sz="2" w:space="0" w:color="E5E7EB" w:frame="1"/>
-        </w:rPr>
-        <w:t>当前状态</w:t>
-      </w:r>
-      <w:r>
-        <w:rPr>
-          <w:rFonts w:ascii="Segoe UI" w:eastAsia="宋体" w:hAnsi="Segoe UI" w:cs="Segoe UI"/>
-          <w:color w:val="CCCCCC"/>
-          <w:kern w:val="0"/>
-          <w:sz w:val="20"/>
-          <w:szCs w:val="20"/>
-        </w:rPr>
-        <w:t>：</w:t>
-      </w:r>
-      <w:r>
-        <w:rPr>
-          <w:rFonts w:ascii="Segoe UI" w:eastAsia="宋体" w:hAnsi="Segoe UI" w:cs="Segoe UI"/>
-          <w:color w:val="CCCCCC"/>
-          <w:kern w:val="0"/>
-          <w:sz w:val="20"/>
-          <w:szCs w:val="20"/>
-        </w:rPr>
-        <w:t xml:space="preserve"> </w:t>
-      </w:r>
-      <w:r>
-        <w:rPr>
-          <w:rFonts w:ascii="Segoe UI" w:eastAsia="宋体" w:hAnsi="Segoe UI" w:cs="Segoe UI"/>
-          <w:color w:val="CCCCCC"/>
-          <w:kern w:val="0"/>
-          <w:sz w:val="20"/>
-          <w:szCs w:val="20"/>
-        </w:rPr>
-        <w:t>我们刚刚完成了组队系统的去邀请码化重构，并上线了自定义</w:t>
-      </w:r>
-      <w:r>
-        <w:rPr>
-          <w:rFonts w:ascii="Segoe UI" w:eastAsia="宋体" w:hAnsi="Segoe UI" w:cs="Segoe UI"/>
-          <w:color w:val="CCCCCC"/>
-          <w:kern w:val="0"/>
-          <w:sz w:val="20"/>
-          <w:szCs w:val="20"/>
-        </w:rPr>
-        <w:t xml:space="preserve"> iOS </w:t>
-      </w:r>
-      <w:r>
-        <w:rPr>
-          <w:rFonts w:ascii="Segoe UI" w:eastAsia="宋体" w:hAnsi="Segoe UI" w:cs="Segoe UI"/>
-          <w:color w:val="CCCCCC"/>
-          <w:kern w:val="0"/>
-          <w:sz w:val="20"/>
-          <w:szCs w:val="20"/>
-        </w:rPr>
-        <w:t>风格弹窗。数据库已通过脚本</w:t>
+          <w:color w:val="CCCCCC"/>
+          <w:kern w:val="0"/>
+          <w:sz w:val="20"/>
+          <w:szCs w:val="20"/>
+        </w:rPr>
+        <w:t>编写并运行了</w:t>
       </w:r>
       <w:r>
         <w:rPr>
@@ -258,6 +1373,15 @@
     <w:p>
       <w:pPr>
         <w:widowControl/>
+        <w:pBdr>
+          <w:top w:val="single" w:sz="2" w:space="0" w:color="E5E7EB"/>
+          <w:left w:val="single" w:sz="2" w:space="0" w:color="E5E7EB"/>
+          <w:bottom w:val="single" w:sz="2" w:space="0" w:color="E5E7EB"/>
+          <w:right w:val="single" w:sz="2" w:space="0" w:color="E5E7EB"/>
+        </w:pBdr>
+        <w:shd w:val="clear" w:color="auto" w:fill="252526"/>
+        <w:spacing w:before="100" w:beforeAutospacing="1" w:after="100" w:afterAutospacing="1"/>
+        <w:ind w:left="1440"/>
         <w:jc w:val="left"/>
         <w:rPr>
           <w:rFonts w:ascii="宋体" w:eastAsia="宋体" w:hAnsi="宋体" w:cs="宋体"/>
@@ -268,20 +1392,21 @@
       </w:pPr>
       <w:r>
         <w:rPr>
-          <w:rFonts w:ascii="宋体" w:eastAsia="宋体" w:hAnsi="宋体" w:cs="宋体"/>
+          <w:rFonts w:ascii="Segoe UI" w:eastAsia="宋体" w:hAnsi="Segoe UI" w:cs="Segoe UI"/>
           <w:noProof/>
-          <w:kern w:val="0"/>
-          <w:sz w:val="24"/>
-          <w:szCs w:val="24"/>
+          <w:color w:val="CCCCCC"/>
+          <w:kern w:val="0"/>
+          <w:sz w:val="20"/>
+          <w:szCs w:val="20"/>
           <w:bdr w:val="single" w:sz="2" w:space="0" w:color="E5E7EB" w:frame="1"/>
         </w:rPr>
         <mc:AlternateContent>
           <mc:Choice Requires="wps">
             <w:drawing>
-              <wp:inline distT="0" distB="0" distL="0" distR="0" wp14:anchorId="6E986F75" wp14:editId="2369C9C2">
+              <wp:inline distT="0" distB="0" distL="0" distR="0" wp14:anchorId="4E78DF94" wp14:editId="15C06A1C">
                 <wp:extent cx="301625" cy="301625"/>
                 <wp:effectExtent l="0" t="0" r="0" b="0"/>
-                <wp:docPr id="1490140690" name="矩形 1"/>
+                <wp:docPr id="228922356" name="矩形 3"/>
                 <wp:cNvGraphicFramePr>
                   <a:graphicFrameLocks xmlns:a="http://schemas.openxmlformats.org/drawingml/2006/main" noChangeAspect="1"/>
                 </wp:cNvGraphicFramePr>
@@ -334,36 +1459,13 @@
           </mc:Choice>
           <mc:Fallback>
             <w:pict>
-              <v:rect w14:anchorId="420AD0E2" id="矩形 1" o:spid="_x0000_s1026" style="width:23.75pt;height:23.75pt;visibility:visible;mso-wrap-style:square;mso-left-percent:-10001;mso-top-percent:-10001;mso-position-horizontal:absolute;mso-position-horizontal-relative:char;mso-position-vertical:absolute;mso-position-vertical-relative:line;mso-left-percent:-10001;mso-top-percent:-10001;v-text-anchor:top" o:gfxdata="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" filled="f" stroked="f">
+              <v:rect w14:anchorId="4BEF2D85" id="矩形 3" o:spid="_x0000_s1026" style="width:23.75pt;height:23.75pt;visibility:visible;mso-wrap-style:square;mso-left-percent:-10001;mso-top-percent:-10001;mso-position-horizontal:absolute;mso-position-horizontal-relative:char;mso-position-vertical:absolute;mso-position-vertical-relative:line;mso-left-percent:-10001;mso-top-percent:-10001;v-text-anchor:top" o:gfxdata="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" filled="f" stroked="f">
                 <o:lock v:ext="edit" aspectratio="t"/>
                 <w10:anchorlock/>
               </v:rect>
             </w:pict>
           </mc:Fallback>
         </mc:AlternateContent>
-      </w:r>
-    </w:p>
-    <w:p>
-      <w:pPr>
-        <w:widowControl/>
-        <w:jc w:val="left"/>
-        <w:rPr>
-          <w:rFonts w:ascii="宋体" w:eastAsia="宋体" w:hAnsi="宋体" w:cs="宋体"/>
-          <w:kern w:val="0"/>
-          <w:sz w:val="24"/>
-          <w:szCs w:val="24"/>
-          <w:bdr w:val="single" w:sz="2" w:space="0" w:color="E5E7EB" w:frame="1"/>
-        </w:rPr>
-      </w:pPr>
-      <w:r>
-        <w:rPr>
-          <w:rFonts w:ascii="宋体" w:eastAsia="宋体" w:hAnsi="宋体" w:cs="宋体"/>
-          <w:kern w:val="0"/>
-          <w:sz w:val="24"/>
-          <w:szCs w:val="24"/>
-          <w:bdr w:val="single" w:sz="2" w:space="0" w:color="E5E7EB" w:frame="1"/>
-        </w:rPr>
-        <w:t>fix_db_schema.py 完成迁移。</w:t>
       </w:r>
     </w:p>
     <w:p>
@@ -375,6 +1477,9 @@
           <w:bottom w:val="single" w:sz="2" w:space="0" w:color="E5E7EB"/>
           <w:right w:val="single" w:sz="2" w:space="0" w:color="E5E7EB"/>
         </w:pBdr>
+        <w:shd w:val="clear" w:color="auto" w:fill="252526"/>
+        <w:spacing w:before="100" w:beforeAutospacing="1" w:after="100" w:afterAutospacing="1"/>
+        <w:ind w:left="1440"/>
         <w:jc w:val="left"/>
         <w:rPr>
           <w:rFonts w:ascii="Segoe UI" w:eastAsia="宋体" w:hAnsi="Segoe UI" w:cs="Segoe UI"/>
@@ -382,7 +1487,333 @@
           <w:kern w:val="0"/>
           <w:sz w:val="20"/>
           <w:szCs w:val="20"/>
-          <w:bdr w:val="single" w:sz="2" w:space="0" w:color="E5E7EB" w:frame="1"/>
+        </w:rPr>
+      </w:pPr>
+      <w:r>
+        <w:rPr>
+          <w:rFonts w:ascii="Segoe UI" w:eastAsia="宋体" w:hAnsi="Segoe UI" w:cs="Segoe UI"/>
+          <w:color w:val="CCCCCC"/>
+          <w:kern w:val="0"/>
+          <w:sz w:val="20"/>
+          <w:szCs w:val="20"/>
+          <w:bdr w:val="single" w:sz="2" w:space="0" w:color="E5E7EB" w:frame="1"/>
+        </w:rPr>
+        <w:t>seed_demo_data.py</w:t>
+      </w:r>
+      <w:r>
+        <w:rPr>
+          <w:rFonts w:ascii="Segoe UI" w:eastAsia="宋体" w:hAnsi="Segoe UI" w:cs="Segoe UI"/>
+          <w:color w:val="CCCCCC"/>
+          <w:kern w:val="0"/>
+          <w:sz w:val="20"/>
+          <w:szCs w:val="20"/>
+        </w:rPr>
+        <w:t> </w:t>
+      </w:r>
+      <w:r>
+        <w:rPr>
+          <w:rFonts w:ascii="Segoe UI" w:eastAsia="宋体" w:hAnsi="Segoe UI" w:cs="Segoe UI"/>
+          <w:color w:val="CCCCCC"/>
+          <w:kern w:val="0"/>
+          <w:sz w:val="20"/>
+          <w:szCs w:val="20"/>
+        </w:rPr>
+        <w:t>测试脚本，生成了一批带有地理信息的模拟用户。</w:t>
+      </w:r>
+    </w:p>
+    <w:p>
+      <w:pPr>
+        <w:widowControl/>
+        <w:numPr>
+          <w:ilvl w:val="1"/>
+          <w:numId w:val="4"/>
+        </w:numPr>
+        <w:pBdr>
+          <w:top w:val="single" w:sz="2" w:space="0" w:color="E5E7EB"/>
+          <w:left w:val="single" w:sz="2" w:space="0" w:color="E5E7EB"/>
+          <w:bottom w:val="single" w:sz="2" w:space="0" w:color="E5E7EB"/>
+          <w:right w:val="single" w:sz="2" w:space="0" w:color="E5E7EB"/>
+        </w:pBdr>
+        <w:shd w:val="clear" w:color="auto" w:fill="252526"/>
+        <w:spacing w:before="100" w:beforeAutospacing="1" w:after="100" w:afterAutospacing="1"/>
+        <w:jc w:val="left"/>
+        <w:rPr>
+          <w:rFonts w:ascii="宋体" w:eastAsia="宋体" w:hAnsi="宋体" w:cs="宋体"/>
+          <w:kern w:val="0"/>
+          <w:sz w:val="24"/>
+          <w:szCs w:val="24"/>
+          <w:bdr w:val="single" w:sz="2" w:space="0" w:color="E5E7EB" w:frame="1"/>
+        </w:rPr>
+      </w:pPr>
+      <w:r>
+        <w:rPr>
+          <w:rFonts w:ascii="Segoe UI" w:eastAsia="宋体" w:hAnsi="Segoe UI" w:cs="Segoe UI"/>
+          <w:color w:val="CCCCCC"/>
+          <w:kern w:val="0"/>
+          <w:sz w:val="20"/>
+          <w:szCs w:val="20"/>
+        </w:rPr>
+        <w:t>前端</w:t>
+      </w:r>
+      <w:r>
+        <w:rPr>
+          <w:rFonts w:ascii="Segoe UI" w:eastAsia="宋体" w:hAnsi="Segoe UI" w:cs="Segoe UI"/>
+          <w:color w:val="CCCCCC"/>
+          <w:kern w:val="0"/>
+          <w:sz w:val="20"/>
+          <w:szCs w:val="20"/>
+        </w:rPr>
+        <w:t> </w:t>
+      </w:r>
+    </w:p>
+    <w:p>
+      <w:pPr>
+        <w:widowControl/>
+        <w:pBdr>
+          <w:top w:val="single" w:sz="2" w:space="0" w:color="E5E7EB"/>
+          <w:left w:val="single" w:sz="2" w:space="0" w:color="E5E7EB"/>
+          <w:bottom w:val="single" w:sz="2" w:space="0" w:color="E5E7EB"/>
+          <w:right w:val="single" w:sz="2" w:space="0" w:color="E5E7EB"/>
+        </w:pBdr>
+        <w:shd w:val="clear" w:color="auto" w:fill="252526"/>
+        <w:spacing w:before="100" w:beforeAutospacing="1" w:after="100" w:afterAutospacing="1"/>
+        <w:ind w:left="1440"/>
+        <w:jc w:val="left"/>
+        <w:rPr>
+          <w:rFonts w:ascii="宋体" w:eastAsia="宋体" w:hAnsi="宋体" w:cs="宋体"/>
+          <w:kern w:val="0"/>
+          <w:sz w:val="24"/>
+          <w:szCs w:val="24"/>
+        </w:rPr>
+      </w:pPr>
+      <w:r>
+        <w:rPr>
+          <w:rFonts w:ascii="Segoe UI" w:eastAsia="宋体" w:hAnsi="Segoe UI" w:cs="Segoe UI"/>
+          <w:noProof/>
+          <w:color w:val="CCCCCC"/>
+          <w:kern w:val="0"/>
+          <w:sz w:val="20"/>
+          <w:szCs w:val="20"/>
+          <w:bdr w:val="single" w:sz="2" w:space="0" w:color="E5E7EB" w:frame="1"/>
+        </w:rPr>
+        <mc:AlternateContent>
+          <mc:Choice Requires="wps">
+            <w:drawing>
+              <wp:inline distT="0" distB="0" distL="0" distR="0" wp14:anchorId="0E2608A9" wp14:editId="16698009">
+                <wp:extent cx="301625" cy="301625"/>
+                <wp:effectExtent l="0" t="0" r="0" b="0"/>
+                <wp:docPr id="160829348" name="矩形 2"/>
+                <wp:cNvGraphicFramePr>
+                  <a:graphicFrameLocks xmlns:a="http://schemas.openxmlformats.org/drawingml/2006/main" noChangeAspect="1"/>
+                </wp:cNvGraphicFramePr>
+                <a:graphic xmlns:a="http://schemas.openxmlformats.org/drawingml/2006/main">
+                  <a:graphicData uri="http://schemas.microsoft.com/office/word/2010/wordprocessingShape">
+                    <wps:wsp>
+                      <wps:cNvSpPr>
+                        <a:spLocks noChangeAspect="1" noChangeArrowheads="1"/>
+                      </wps:cNvSpPr>
+                      <wps:spPr bwMode="auto">
+                        <a:xfrm>
+                          <a:off x="0" y="0"/>
+                          <a:ext cx="301625" cy="301625"/>
+                        </a:xfrm>
+                        <a:prstGeom prst="rect">
+                          <a:avLst/>
+                        </a:prstGeom>
+                        <a:noFill/>
+                        <a:ln>
+                          <a:noFill/>
+                        </a:ln>
+                        <a:extLst>
+                          <a:ext uri="{909E8E84-426E-40DD-AFC4-6F175D3DCCD1}">
+                            <a14:hiddenFill xmlns:a14="http://schemas.microsoft.com/office/drawing/2010/main">
+                              <a:solidFill>
+                                <a:srgbClr val="FFFFFF"/>
+                              </a:solidFill>
+                            </a14:hiddenFill>
+                          </a:ext>
+                          <a:ext uri="{91240B29-F687-4F45-9708-019B960494DF}">
+                            <a14:hiddenLine xmlns:a14="http://schemas.microsoft.com/office/drawing/2010/main" w="9525">
+                              <a:solidFill>
+                                <a:srgbClr val="000000"/>
+                              </a:solidFill>
+                              <a:miter lim="800000"/>
+                              <a:headEnd/>
+                              <a:tailEnd/>
+                            </a14:hiddenLine>
+                          </a:ext>
+                        </a:extLst>
+                      </wps:spPr>
+                      <wps:bodyPr rot="0" vert="horz" wrap="square" lIns="91440" tIns="45720" rIns="91440" bIns="45720" anchor="t" anchorCtr="0" upright="1">
+                        <a:noAutofit/>
+                      </wps:bodyPr>
+                    </wps:wsp>
+                  </a:graphicData>
+                </a:graphic>
+              </wp:inline>
+            </w:drawing>
+          </mc:Choice>
+          <mc:Fallback>
+            <w:pict>
+              <v:rect w14:anchorId="743BA6B8" id="矩形 2" o:spid="_x0000_s1026" style="width:23.75pt;height:23.75pt;visibility:visible;mso-wrap-style:square;mso-left-percent:-10001;mso-top-percent:-10001;mso-position-horizontal:absolute;mso-position-horizontal-relative:char;mso-position-vertical:absolute;mso-position-vertical-relative:line;mso-left-percent:-10001;mso-top-percent:-10001;v-text-anchor:top" o:gfxdata="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" filled="f" stroked="f">
+                <o:lock v:ext="edit" aspectratio="t"/>
+                <w10:anchorlock/>
+              </v:rect>
+            </w:pict>
+          </mc:Fallback>
+        </mc:AlternateContent>
+      </w:r>
+    </w:p>
+    <w:p>
+      <w:pPr>
+        <w:widowControl/>
+        <w:pBdr>
+          <w:top w:val="single" w:sz="2" w:space="0" w:color="E5E7EB"/>
+          <w:left w:val="single" w:sz="2" w:space="0" w:color="E5E7EB"/>
+          <w:bottom w:val="single" w:sz="2" w:space="0" w:color="E5E7EB"/>
+          <w:right w:val="single" w:sz="2" w:space="0" w:color="E5E7EB"/>
+        </w:pBdr>
+        <w:shd w:val="clear" w:color="auto" w:fill="252526"/>
+        <w:spacing w:before="100" w:beforeAutospacing="1" w:after="100" w:afterAutospacing="1"/>
+        <w:ind w:left="1440"/>
+        <w:jc w:val="left"/>
+        <w:rPr>
+          <w:rFonts w:ascii="Segoe UI" w:eastAsia="宋体" w:hAnsi="Segoe UI" w:cs="Segoe UI"/>
+          <w:color w:val="CCCCCC"/>
+          <w:kern w:val="0"/>
+          <w:sz w:val="20"/>
+          <w:szCs w:val="20"/>
+        </w:rPr>
+      </w:pPr>
+      <w:r>
+        <w:rPr>
+          <w:rFonts w:ascii="Segoe UI" w:eastAsia="宋体" w:hAnsi="Segoe UI" w:cs="Segoe UI"/>
+          <w:color w:val="CCCCCC"/>
+          <w:kern w:val="0"/>
+          <w:sz w:val="20"/>
+          <w:szCs w:val="20"/>
+          <w:bdr w:val="single" w:sz="2" w:space="0" w:color="E5E7EB" w:frame="1"/>
+        </w:rPr>
+        <w:t>BondsPortal</w:t>
+      </w:r>
+      <w:r>
+        <w:rPr>
+          <w:rFonts w:ascii="Segoe UI" w:eastAsia="宋体" w:hAnsi="Segoe UI" w:cs="Segoe UI"/>
+          <w:color w:val="CCCCCC"/>
+          <w:kern w:val="0"/>
+          <w:sz w:val="20"/>
+          <w:szCs w:val="20"/>
+        </w:rPr>
+        <w:t> </w:t>
+      </w:r>
+      <w:r>
+        <w:rPr>
+          <w:rFonts w:ascii="Segoe UI" w:eastAsia="宋体" w:hAnsi="Segoe UI" w:cs="Segoe UI"/>
+          <w:color w:val="CCCCCC"/>
+          <w:kern w:val="0"/>
+          <w:sz w:val="20"/>
+          <w:szCs w:val="20"/>
+        </w:rPr>
+        <w:t>的操作菜单已简化为</w:t>
+      </w:r>
+      <w:r>
+        <w:rPr>
+          <w:rFonts w:ascii="Segoe UI" w:eastAsia="宋体" w:hAnsi="Segoe UI" w:cs="Segoe UI"/>
+          <w:color w:val="CCCCCC"/>
+          <w:kern w:val="0"/>
+          <w:sz w:val="20"/>
+          <w:szCs w:val="20"/>
+        </w:rPr>
+        <w:t>“</w:t>
+      </w:r>
+      <w:r>
+        <w:rPr>
+          <w:rFonts w:ascii="Segoe UI" w:eastAsia="宋体" w:hAnsi="Segoe UI" w:cs="Segoe UI"/>
+          <w:color w:val="CCCCCC"/>
+          <w:kern w:val="0"/>
+          <w:sz w:val="20"/>
+          <w:szCs w:val="20"/>
+        </w:rPr>
+        <w:t>删除</w:t>
+      </w:r>
+      <w:r>
+        <w:rPr>
+          <w:rFonts w:ascii="Segoe UI" w:eastAsia="宋体" w:hAnsi="Segoe UI" w:cs="Segoe UI"/>
+          <w:color w:val="CCCCCC"/>
+          <w:kern w:val="0"/>
+          <w:sz w:val="20"/>
+          <w:szCs w:val="20"/>
+        </w:rPr>
+        <w:t>”</w:t>
+      </w:r>
+      <w:r>
+        <w:rPr>
+          <w:rFonts w:ascii="Segoe UI" w:eastAsia="宋体" w:hAnsi="Segoe UI" w:cs="Segoe UI"/>
+          <w:color w:val="CCCCCC"/>
+          <w:kern w:val="0"/>
+          <w:sz w:val="20"/>
+          <w:szCs w:val="20"/>
+        </w:rPr>
+        <w:t>和</w:t>
+      </w:r>
+      <w:r>
+        <w:rPr>
+          <w:rFonts w:ascii="Segoe UI" w:eastAsia="宋体" w:hAnsi="Segoe UI" w:cs="Segoe UI"/>
+          <w:color w:val="CCCCCC"/>
+          <w:kern w:val="0"/>
+          <w:sz w:val="20"/>
+          <w:szCs w:val="20"/>
+        </w:rPr>
+        <w:t>“</w:t>
+      </w:r>
+      <w:r>
+        <w:rPr>
+          <w:rFonts w:ascii="Segoe UI" w:eastAsia="宋体" w:hAnsi="Segoe UI" w:cs="Segoe UI"/>
+          <w:color w:val="CCCCCC"/>
+          <w:kern w:val="0"/>
+          <w:sz w:val="20"/>
+          <w:szCs w:val="20"/>
+        </w:rPr>
+        <w:t>拉黑</w:t>
+      </w:r>
+      <w:r>
+        <w:rPr>
+          <w:rFonts w:ascii="Segoe UI" w:eastAsia="宋体" w:hAnsi="Segoe UI" w:cs="Segoe UI"/>
+          <w:color w:val="CCCCCC"/>
+          <w:kern w:val="0"/>
+          <w:sz w:val="20"/>
+          <w:szCs w:val="20"/>
+        </w:rPr>
+        <w:t>”</w:t>
+      </w:r>
+      <w:r>
+        <w:rPr>
+          <w:rFonts w:ascii="Segoe UI" w:eastAsia="宋体" w:hAnsi="Segoe UI" w:cs="Segoe UI"/>
+          <w:color w:val="CCCCCC"/>
+          <w:kern w:val="0"/>
+          <w:sz w:val="20"/>
+          <w:szCs w:val="20"/>
+        </w:rPr>
+        <w:t>。</w:t>
+      </w:r>
+    </w:p>
+    <w:p>
+      <w:pPr>
+        <w:widowControl/>
+        <w:pBdr>
+          <w:top w:val="single" w:sz="2" w:space="0" w:color="E5E7EB"/>
+          <w:left w:val="single" w:sz="2" w:space="0" w:color="E5E7EB"/>
+          <w:bottom w:val="single" w:sz="2" w:space="0" w:color="E5E7EB"/>
+          <w:right w:val="single" w:sz="2" w:space="0" w:color="E5E7EB"/>
+        </w:pBdr>
+        <w:shd w:val="clear" w:color="auto" w:fill="252526"/>
+        <w:jc w:val="left"/>
+        <w:rPr>
+          <w:rFonts w:ascii="Segoe UI" w:eastAsia="宋体" w:hAnsi="Segoe UI" w:cs="Segoe UI"/>
+          <w:color w:val="CCCCCC"/>
+          <w:kern w:val="0"/>
+          <w:sz w:val="20"/>
+          <w:szCs w:val="20"/>
         </w:rPr>
       </w:pPr>
       <w:r>
@@ -396,73 +1827,1055 @@
           <w:szCs w:val="20"/>
           <w:bdr w:val="single" w:sz="2" w:space="0" w:color="E5E7EB" w:frame="1"/>
         </w:rPr>
-        <w:t>接下来的工作</w:t>
-      </w:r>
-      <w:r>
-        <w:rPr>
-          <w:rFonts w:ascii="Segoe UI" w:eastAsia="宋体" w:hAnsi="Segoe UI" w:cs="Segoe UI"/>
-          <w:color w:val="CCCCCC"/>
-          <w:kern w:val="0"/>
-          <w:sz w:val="20"/>
-          <w:szCs w:val="20"/>
-          <w:bdr w:val="single" w:sz="2" w:space="0" w:color="E5E7EB" w:frame="1"/>
-        </w:rPr>
-        <w:t>：</w:t>
-      </w:r>
-      <w:r>
-        <w:rPr>
-          <w:rFonts w:ascii="Segoe UI" w:eastAsia="宋体" w:hAnsi="Segoe UI" w:cs="Segoe UI"/>
-          <w:color w:val="CCCCCC"/>
-          <w:kern w:val="0"/>
-          <w:sz w:val="20"/>
-          <w:szCs w:val="20"/>
-          <w:bdr w:val="single" w:sz="2" w:space="0" w:color="E5E7EB" w:frame="1"/>
-        </w:rPr>
-        <w:t xml:space="preserve"> [ </w:t>
-      </w:r>
-      <w:r>
-        <w:rPr>
-          <w:rFonts w:ascii="Segoe UI" w:eastAsia="宋体" w:hAnsi="Segoe UI" w:cs="Segoe UI"/>
-          <w:color w:val="CCCCCC"/>
-          <w:kern w:val="0"/>
-          <w:sz w:val="20"/>
-          <w:szCs w:val="20"/>
-          <w:bdr w:val="single" w:sz="2" w:space="0" w:color="E5E7EB" w:frame="1"/>
-        </w:rPr>
-        <w:t>在这里输入您想继续做的任务，例如：完善管理员审批界面</w:t>
-      </w:r>
-      <w:r>
-        <w:rPr>
-          <w:rFonts w:ascii="Segoe UI" w:eastAsia="宋体" w:hAnsi="Segoe UI" w:cs="Segoe UI"/>
-          <w:color w:val="CCCCCC"/>
-          <w:kern w:val="0"/>
-          <w:sz w:val="20"/>
-          <w:szCs w:val="20"/>
-          <w:bdr w:val="single" w:sz="2" w:space="0" w:color="E5E7EB" w:frame="1"/>
-        </w:rPr>
-        <w:t xml:space="preserve"> / </w:t>
-      </w:r>
-      <w:r>
-        <w:rPr>
-          <w:rFonts w:ascii="Segoe UI" w:eastAsia="宋体" w:hAnsi="Segoe UI" w:cs="Segoe UI"/>
-          <w:color w:val="CCCCCC"/>
-          <w:kern w:val="0"/>
-          <w:sz w:val="20"/>
-          <w:szCs w:val="20"/>
-          <w:bdr w:val="single" w:sz="2" w:space="0" w:color="E5E7EB" w:frame="1"/>
-        </w:rPr>
-        <w:t>增加用户搜索功能</w:t>
-      </w:r>
-      <w:r>
-        <w:rPr>
-          <w:rFonts w:ascii="Segoe UI" w:eastAsia="宋体" w:hAnsi="Segoe UI" w:cs="Segoe UI"/>
-          <w:color w:val="CCCCCC"/>
-          <w:kern w:val="0"/>
-          <w:sz w:val="20"/>
-          <w:szCs w:val="20"/>
-          <w:bdr w:val="single" w:sz="2" w:space="0" w:color="E5E7EB" w:frame="1"/>
-        </w:rPr>
-        <w:t xml:space="preserve"> ]</w:t>
+        <w:t xml:space="preserve">4. </w:t>
+      </w:r>
+      <w:r>
+        <w:rPr>
+          <w:rFonts w:ascii="Segoe UI" w:eastAsia="宋体" w:hAnsi="Segoe UI" w:cs="Segoe UI"/>
+          <w:b/>
+          <w:bCs/>
+          <w:color w:val="CCCCCC"/>
+          <w:kern w:val="0"/>
+          <w:sz w:val="20"/>
+          <w:szCs w:val="20"/>
+          <w:bdr w:val="single" w:sz="2" w:space="0" w:color="E5E7EB" w:frame="1"/>
+        </w:rPr>
+        <w:t>你的当前需求与待办任务</w:t>
+      </w:r>
+      <w:r>
+        <w:rPr>
+          <w:rFonts w:ascii="Segoe UI" w:eastAsia="宋体" w:hAnsi="Segoe UI" w:cs="Segoe UI"/>
+          <w:b/>
+          <w:bCs/>
+          <w:color w:val="CCCCCC"/>
+          <w:kern w:val="0"/>
+          <w:sz w:val="20"/>
+          <w:szCs w:val="20"/>
+          <w:bdr w:val="single" w:sz="2" w:space="0" w:color="E5E7EB" w:frame="1"/>
+        </w:rPr>
+        <w:t xml:space="preserve"> (Current Needs &amp; Todo)</w:t>
+      </w:r>
+    </w:p>
+    <w:p>
+      <w:pPr>
+        <w:widowControl/>
+        <w:numPr>
+          <w:ilvl w:val="0"/>
+          <w:numId w:val="5"/>
+        </w:numPr>
+        <w:pBdr>
+          <w:top w:val="single" w:sz="2" w:space="0" w:color="E5E7EB"/>
+          <w:left w:val="single" w:sz="2" w:space="0" w:color="E5E7EB"/>
+          <w:bottom w:val="single" w:sz="2" w:space="0" w:color="E5E7EB"/>
+          <w:right w:val="single" w:sz="2" w:space="0" w:color="E5E7EB"/>
+        </w:pBdr>
+        <w:shd w:val="clear" w:color="auto" w:fill="252526"/>
+        <w:spacing w:before="100" w:beforeAutospacing="1" w:after="100" w:afterAutospacing="1"/>
+        <w:jc w:val="left"/>
+        <w:rPr>
+          <w:rFonts w:ascii="Segoe UI" w:eastAsia="宋体" w:hAnsi="Segoe UI" w:cs="Segoe UI"/>
+          <w:color w:val="CCCCCC"/>
+          <w:kern w:val="0"/>
+          <w:sz w:val="20"/>
+          <w:szCs w:val="20"/>
+        </w:rPr>
+      </w:pPr>
+      <w:r>
+        <w:rPr>
+          <w:rFonts w:ascii="Segoe UI" w:eastAsia="宋体" w:hAnsi="Segoe UI" w:cs="Segoe UI"/>
+          <w:color w:val="CCCCCC"/>
+          <w:kern w:val="0"/>
+          <w:sz w:val="20"/>
+          <w:szCs w:val="20"/>
+        </w:rPr>
+        <w:t> </w:t>
+      </w:r>
+      <w:r>
+        <w:rPr>
+          <w:rFonts w:ascii="Segoe UI" w:eastAsia="宋体" w:hAnsi="Segoe UI" w:cs="Segoe UI"/>
+          <w:b/>
+          <w:bCs/>
+          <w:color w:val="CCCCCC"/>
+          <w:kern w:val="0"/>
+          <w:sz w:val="20"/>
+          <w:szCs w:val="20"/>
+          <w:bdr w:val="single" w:sz="2" w:space="0" w:color="E5E7EB" w:frame="1"/>
+        </w:rPr>
+        <w:t>功能校验</w:t>
+      </w:r>
+      <w:r>
+        <w:rPr>
+          <w:rFonts w:ascii="Segoe UI" w:eastAsia="宋体" w:hAnsi="Segoe UI" w:cs="Segoe UI"/>
+          <w:color w:val="CCCCCC"/>
+          <w:kern w:val="0"/>
+          <w:sz w:val="20"/>
+          <w:szCs w:val="20"/>
+        </w:rPr>
+        <w:t>：进一步测试搜索结果的距离排序是否</w:t>
+      </w:r>
+      <w:r>
+        <w:rPr>
+          <w:rFonts w:ascii="Segoe UI" w:eastAsia="宋体" w:hAnsi="Segoe UI" w:cs="Segoe UI"/>
+          <w:color w:val="CCCCCC"/>
+          <w:kern w:val="0"/>
+          <w:sz w:val="20"/>
+          <w:szCs w:val="20"/>
+        </w:rPr>
+        <w:t xml:space="preserve"> 100% </w:t>
+      </w:r>
+      <w:r>
+        <w:rPr>
+          <w:rFonts w:ascii="Segoe UI" w:eastAsia="宋体" w:hAnsi="Segoe UI" w:cs="Segoe UI"/>
+          <w:color w:val="CCCCCC"/>
+          <w:kern w:val="0"/>
+          <w:sz w:val="20"/>
+          <w:szCs w:val="20"/>
+        </w:rPr>
+        <w:t>正确。</w:t>
+      </w:r>
+    </w:p>
+    <w:p>
+      <w:pPr>
+        <w:widowControl/>
+        <w:numPr>
+          <w:ilvl w:val="0"/>
+          <w:numId w:val="5"/>
+        </w:numPr>
+        <w:pBdr>
+          <w:top w:val="single" w:sz="2" w:space="0" w:color="E5E7EB"/>
+          <w:left w:val="single" w:sz="2" w:space="0" w:color="E5E7EB"/>
+          <w:bottom w:val="single" w:sz="2" w:space="0" w:color="E5E7EB"/>
+          <w:right w:val="single" w:sz="2" w:space="0" w:color="E5E7EB"/>
+        </w:pBdr>
+        <w:shd w:val="clear" w:color="auto" w:fill="252526"/>
+        <w:spacing w:before="100" w:beforeAutospacing="1" w:after="100" w:afterAutospacing="1"/>
+        <w:jc w:val="left"/>
+        <w:rPr>
+          <w:rFonts w:ascii="Segoe UI" w:eastAsia="宋体" w:hAnsi="Segoe UI" w:cs="Segoe UI"/>
+          <w:color w:val="CCCCCC"/>
+          <w:kern w:val="0"/>
+          <w:sz w:val="20"/>
+          <w:szCs w:val="20"/>
+        </w:rPr>
+      </w:pPr>
+      <w:r>
+        <w:rPr>
+          <w:rFonts w:ascii="Segoe UI" w:eastAsia="宋体" w:hAnsi="Segoe UI" w:cs="Segoe UI"/>
+          <w:color w:val="CCCCCC"/>
+          <w:kern w:val="0"/>
+          <w:sz w:val="20"/>
+          <w:szCs w:val="20"/>
+        </w:rPr>
+        <w:lastRenderedPageBreak/>
+        <w:t> </w:t>
+      </w:r>
+      <w:r>
+        <w:rPr>
+          <w:rFonts w:ascii="Segoe UI" w:eastAsia="宋体" w:hAnsi="Segoe UI" w:cs="Segoe UI"/>
+          <w:b/>
+          <w:bCs/>
+          <w:color w:val="CCCCCC"/>
+          <w:kern w:val="0"/>
+          <w:sz w:val="20"/>
+          <w:szCs w:val="20"/>
+          <w:bdr w:val="single" w:sz="2" w:space="0" w:color="E5E7EB" w:frame="1"/>
+        </w:rPr>
+        <w:t>小组功能增强</w:t>
+      </w:r>
+      <w:r>
+        <w:rPr>
+          <w:rFonts w:ascii="Segoe UI" w:eastAsia="宋体" w:hAnsi="Segoe UI" w:cs="Segoe UI"/>
+          <w:color w:val="CCCCCC"/>
+          <w:kern w:val="0"/>
+          <w:sz w:val="20"/>
+          <w:szCs w:val="20"/>
+        </w:rPr>
+        <w:t>：计划实现</w:t>
+      </w:r>
+      <w:r>
+        <w:rPr>
+          <w:rFonts w:ascii="Segoe UI" w:eastAsia="宋体" w:hAnsi="Segoe UI" w:cs="Segoe UI"/>
+          <w:color w:val="CCCCCC"/>
+          <w:kern w:val="0"/>
+          <w:sz w:val="20"/>
+          <w:szCs w:val="20"/>
+        </w:rPr>
+        <w:t>“</w:t>
+      </w:r>
+      <w:r>
+        <w:rPr>
+          <w:rFonts w:ascii="Segoe UI" w:eastAsia="宋体" w:hAnsi="Segoe UI" w:cs="Segoe UI"/>
+          <w:color w:val="CCCCCC"/>
+          <w:kern w:val="0"/>
+          <w:sz w:val="20"/>
+          <w:szCs w:val="20"/>
+        </w:rPr>
+        <w:t>组长邀请好友加入小组</w:t>
+      </w:r>
+      <w:r>
+        <w:rPr>
+          <w:rFonts w:ascii="Segoe UI" w:eastAsia="宋体" w:hAnsi="Segoe UI" w:cs="Segoe UI"/>
+          <w:color w:val="CCCCCC"/>
+          <w:kern w:val="0"/>
+          <w:sz w:val="20"/>
+          <w:szCs w:val="20"/>
+        </w:rPr>
+        <w:t>”</w:t>
+      </w:r>
+      <w:r>
+        <w:rPr>
+          <w:rFonts w:ascii="Segoe UI" w:eastAsia="宋体" w:hAnsi="Segoe UI" w:cs="Segoe UI"/>
+          <w:color w:val="CCCCCC"/>
+          <w:kern w:val="0"/>
+          <w:sz w:val="20"/>
+          <w:szCs w:val="20"/>
+        </w:rPr>
+        <w:t>的功能，目前由于去掉了</w:t>
+      </w:r>
+      <w:r>
+        <w:rPr>
+          <w:rFonts w:ascii="Segoe UI" w:eastAsia="宋体" w:hAnsi="Segoe UI" w:cs="Segoe UI"/>
+          <w:color w:val="CCCCCC"/>
+          <w:kern w:val="0"/>
+          <w:sz w:val="20"/>
+          <w:szCs w:val="20"/>
+        </w:rPr>
+        <w:t>“</w:t>
+      </w:r>
+      <w:r>
+        <w:rPr>
+          <w:rFonts w:ascii="Segoe UI" w:eastAsia="宋体" w:hAnsi="Segoe UI" w:cs="Segoe UI"/>
+          <w:color w:val="CCCCCC"/>
+          <w:kern w:val="0"/>
+          <w:sz w:val="20"/>
+          <w:szCs w:val="20"/>
+        </w:rPr>
+        <w:t>申请加入</w:t>
+      </w:r>
+      <w:r>
+        <w:rPr>
+          <w:rFonts w:ascii="Segoe UI" w:eastAsia="宋体" w:hAnsi="Segoe UI" w:cs="Segoe UI"/>
+          <w:color w:val="CCCCCC"/>
+          <w:kern w:val="0"/>
+          <w:sz w:val="20"/>
+          <w:szCs w:val="20"/>
+        </w:rPr>
+        <w:t>”</w:t>
+      </w:r>
+      <w:r>
+        <w:rPr>
+          <w:rFonts w:ascii="Segoe UI" w:eastAsia="宋体" w:hAnsi="Segoe UI" w:cs="Segoe UI"/>
+          <w:color w:val="CCCCCC"/>
+          <w:kern w:val="0"/>
+          <w:sz w:val="20"/>
+          <w:szCs w:val="20"/>
+        </w:rPr>
+        <w:t>，邀请成为了唯一的入组途径。</w:t>
+      </w:r>
+    </w:p>
+    <w:p>
+      <w:pPr>
+        <w:widowControl/>
+        <w:numPr>
+          <w:ilvl w:val="0"/>
+          <w:numId w:val="5"/>
+        </w:numPr>
+        <w:pBdr>
+          <w:top w:val="single" w:sz="2" w:space="0" w:color="E5E7EB"/>
+          <w:left w:val="single" w:sz="2" w:space="0" w:color="E5E7EB"/>
+          <w:bottom w:val="single" w:sz="2" w:space="0" w:color="E5E7EB"/>
+          <w:right w:val="single" w:sz="2" w:space="0" w:color="E5E7EB"/>
+        </w:pBdr>
+        <w:shd w:val="clear" w:color="auto" w:fill="252526"/>
+        <w:spacing w:before="100" w:beforeAutospacing="1" w:after="100" w:afterAutospacing="1"/>
+        <w:jc w:val="left"/>
+        <w:rPr>
+          <w:rFonts w:ascii="Segoe UI" w:eastAsia="宋体" w:hAnsi="Segoe UI" w:cs="Segoe UI"/>
+          <w:color w:val="CCCCCC"/>
+          <w:kern w:val="0"/>
+          <w:sz w:val="20"/>
+          <w:szCs w:val="20"/>
+        </w:rPr>
+      </w:pPr>
+      <w:r>
+        <w:rPr>
+          <w:rFonts w:ascii="Segoe UI" w:eastAsia="宋体" w:hAnsi="Segoe UI" w:cs="Segoe UI"/>
+          <w:color w:val="CCCCCC"/>
+          <w:kern w:val="0"/>
+          <w:sz w:val="20"/>
+          <w:szCs w:val="20"/>
+        </w:rPr>
+        <w:t> </w:t>
+      </w:r>
+      <w:r>
+        <w:rPr>
+          <w:rFonts w:ascii="Segoe UI" w:eastAsia="宋体" w:hAnsi="Segoe UI" w:cs="Segoe UI"/>
+          <w:b/>
+          <w:bCs/>
+          <w:color w:val="CCCCCC"/>
+          <w:kern w:val="0"/>
+          <w:sz w:val="20"/>
+          <w:szCs w:val="20"/>
+          <w:bdr w:val="single" w:sz="2" w:space="0" w:color="E5E7EB" w:frame="1"/>
+        </w:rPr>
+        <w:t xml:space="preserve">UI </w:t>
+      </w:r>
+      <w:r>
+        <w:rPr>
+          <w:rFonts w:ascii="Segoe UI" w:eastAsia="宋体" w:hAnsi="Segoe UI" w:cs="Segoe UI"/>
+          <w:b/>
+          <w:bCs/>
+          <w:color w:val="CCCCCC"/>
+          <w:kern w:val="0"/>
+          <w:sz w:val="20"/>
+          <w:szCs w:val="20"/>
+          <w:bdr w:val="single" w:sz="2" w:space="0" w:color="E5E7EB" w:frame="1"/>
+        </w:rPr>
+        <w:t>细节微调</w:t>
+      </w:r>
+      <w:r>
+        <w:rPr>
+          <w:rFonts w:ascii="Segoe UI" w:eastAsia="宋体" w:hAnsi="Segoe UI" w:cs="Segoe UI"/>
+          <w:color w:val="CCCCCC"/>
+          <w:kern w:val="0"/>
+          <w:sz w:val="20"/>
+          <w:szCs w:val="20"/>
+        </w:rPr>
+        <w:t>：保持所有新功能（如邀请弹窗）的风格与</w:t>
+      </w:r>
+      <w:r>
+        <w:rPr>
+          <w:rFonts w:ascii="Segoe UI" w:eastAsia="宋体" w:hAnsi="Segoe UI" w:cs="Segoe UI"/>
+          <w:color w:val="CCCCCC"/>
+          <w:kern w:val="0"/>
+          <w:sz w:val="20"/>
+          <w:szCs w:val="20"/>
+        </w:rPr>
+        <w:t xml:space="preserve"> App </w:t>
+      </w:r>
+      <w:r>
+        <w:rPr>
+          <w:rFonts w:ascii="Segoe UI" w:eastAsia="宋体" w:hAnsi="Segoe UI" w:cs="Segoe UI"/>
+          <w:color w:val="CCCCCC"/>
+          <w:kern w:val="0"/>
+          <w:sz w:val="20"/>
+          <w:szCs w:val="20"/>
+        </w:rPr>
+        <w:t>内部</w:t>
+      </w:r>
+      <w:r>
+        <w:rPr>
+          <w:rFonts w:ascii="Segoe UI" w:eastAsia="宋体" w:hAnsi="Segoe UI" w:cs="Segoe UI"/>
+          <w:color w:val="CCCCCC"/>
+          <w:kern w:val="0"/>
+          <w:sz w:val="20"/>
+          <w:szCs w:val="20"/>
+        </w:rPr>
+        <w:t xml:space="preserve"> iOS </w:t>
+      </w:r>
+      <w:r>
+        <w:rPr>
+          <w:rFonts w:ascii="Segoe UI" w:eastAsia="宋体" w:hAnsi="Segoe UI" w:cs="Segoe UI"/>
+          <w:color w:val="CCCCCC"/>
+          <w:kern w:val="0"/>
+          <w:sz w:val="20"/>
+          <w:szCs w:val="20"/>
+        </w:rPr>
+        <w:t>风格一致。</w:t>
+      </w:r>
+    </w:p>
+    <w:p>
+      <w:pPr>
+        <w:widowControl/>
+        <w:numPr>
+          <w:ilvl w:val="0"/>
+          <w:numId w:val="5"/>
+        </w:numPr>
+        <w:pBdr>
+          <w:top w:val="single" w:sz="2" w:space="0" w:color="E5E7EB"/>
+          <w:left w:val="single" w:sz="2" w:space="0" w:color="E5E7EB"/>
+          <w:bottom w:val="single" w:sz="2" w:space="0" w:color="E5E7EB"/>
+          <w:right w:val="single" w:sz="2" w:space="0" w:color="E5E7EB"/>
+        </w:pBdr>
+        <w:shd w:val="clear" w:color="auto" w:fill="252526"/>
+        <w:spacing w:before="100" w:beforeAutospacing="1" w:after="100" w:afterAutospacing="1"/>
+        <w:jc w:val="left"/>
+        <w:rPr>
+          <w:rFonts w:ascii="宋体" w:eastAsia="宋体" w:hAnsi="宋体" w:cs="宋体"/>
+          <w:kern w:val="0"/>
+          <w:sz w:val="24"/>
+          <w:szCs w:val="24"/>
+          <w:bdr w:val="single" w:sz="2" w:space="0" w:color="E5E7EB" w:frame="1"/>
+        </w:rPr>
+      </w:pPr>
+      <w:r>
+        <w:rPr>
+          <w:rFonts w:ascii="Segoe UI" w:eastAsia="宋体" w:hAnsi="Segoe UI" w:cs="Segoe UI"/>
+          <w:color w:val="CCCCCC"/>
+          <w:kern w:val="0"/>
+          <w:sz w:val="20"/>
+          <w:szCs w:val="20"/>
+        </w:rPr>
+        <w:t> </w:t>
+      </w:r>
+      <w:r>
+        <w:rPr>
+          <w:rFonts w:ascii="Segoe UI" w:eastAsia="宋体" w:hAnsi="Segoe UI" w:cs="Segoe UI"/>
+          <w:b/>
+          <w:bCs/>
+          <w:color w:val="CCCCCC"/>
+          <w:kern w:val="0"/>
+          <w:sz w:val="20"/>
+          <w:szCs w:val="20"/>
+          <w:bdr w:val="single" w:sz="2" w:space="0" w:color="E5E7EB" w:frame="1"/>
+        </w:rPr>
+        <w:t>持久化与清理</w:t>
+      </w:r>
+      <w:r>
+        <w:rPr>
+          <w:rFonts w:ascii="Segoe UI" w:eastAsia="宋体" w:hAnsi="Segoe UI" w:cs="Segoe UI"/>
+          <w:color w:val="CCCCCC"/>
+          <w:kern w:val="0"/>
+          <w:sz w:val="20"/>
+          <w:szCs w:val="20"/>
+        </w:rPr>
+        <w:t>：目前的</w:t>
+      </w:r>
+      <w:r>
+        <w:rPr>
+          <w:rFonts w:ascii="Segoe UI" w:eastAsia="宋体" w:hAnsi="Segoe UI" w:cs="Segoe UI"/>
+          <w:color w:val="CCCCCC"/>
+          <w:kern w:val="0"/>
+          <w:sz w:val="20"/>
+          <w:szCs w:val="20"/>
+        </w:rPr>
+        <w:t> </w:t>
+      </w:r>
+    </w:p>
+    <w:p>
+      <w:pPr>
+        <w:widowControl/>
+        <w:pBdr>
+          <w:top w:val="single" w:sz="2" w:space="0" w:color="E5E7EB"/>
+          <w:left w:val="single" w:sz="2" w:space="0" w:color="E5E7EB"/>
+          <w:bottom w:val="single" w:sz="2" w:space="0" w:color="E5E7EB"/>
+          <w:right w:val="single" w:sz="2" w:space="0" w:color="E5E7EB"/>
+        </w:pBdr>
+        <w:shd w:val="clear" w:color="auto" w:fill="252526"/>
+        <w:spacing w:before="100" w:beforeAutospacing="1" w:after="100" w:afterAutospacing="1"/>
+        <w:ind w:left="720"/>
+        <w:jc w:val="left"/>
+        <w:rPr>
+          <w:rFonts w:ascii="宋体" w:eastAsia="宋体" w:hAnsi="宋体" w:cs="宋体"/>
+          <w:kern w:val="0"/>
+          <w:sz w:val="24"/>
+          <w:szCs w:val="24"/>
+        </w:rPr>
+      </w:pPr>
+      <w:r>
+        <w:rPr>
+          <w:rFonts w:ascii="Segoe UI" w:eastAsia="宋体" w:hAnsi="Segoe UI" w:cs="Segoe UI"/>
+          <w:noProof/>
+          <w:color w:val="CCCCCC"/>
+          <w:kern w:val="0"/>
+          <w:sz w:val="20"/>
+          <w:szCs w:val="20"/>
+          <w:bdr w:val="single" w:sz="2" w:space="0" w:color="E5E7EB" w:frame="1"/>
+        </w:rPr>
+        <mc:AlternateContent>
+          <mc:Choice Requires="wps">
+            <w:drawing>
+              <wp:inline distT="0" distB="0" distL="0" distR="0" wp14:anchorId="6426F157" wp14:editId="2B9FE86C">
+                <wp:extent cx="301625" cy="301625"/>
+                <wp:effectExtent l="0" t="0" r="0" b="0"/>
+                <wp:docPr id="1126732498" name="矩形 1"/>
+                <wp:cNvGraphicFramePr>
+                  <a:graphicFrameLocks xmlns:a="http://schemas.openxmlformats.org/drawingml/2006/main" noChangeAspect="1"/>
+                </wp:cNvGraphicFramePr>
+                <a:graphic xmlns:a="http://schemas.openxmlformats.org/drawingml/2006/main">
+                  <a:graphicData uri="http://schemas.microsoft.com/office/word/2010/wordprocessingShape">
+                    <wps:wsp>
+                      <wps:cNvSpPr>
+                        <a:spLocks noChangeAspect="1" noChangeArrowheads="1"/>
+                      </wps:cNvSpPr>
+                      <wps:spPr bwMode="auto">
+                        <a:xfrm>
+                          <a:off x="0" y="0"/>
+                          <a:ext cx="301625" cy="301625"/>
+                        </a:xfrm>
+                        <a:prstGeom prst="rect">
+                          <a:avLst/>
+                        </a:prstGeom>
+                        <a:noFill/>
+                        <a:ln>
+                          <a:noFill/>
+                        </a:ln>
+                        <a:extLst>
+                          <a:ext uri="{909E8E84-426E-40DD-AFC4-6F175D3DCCD1}">
+                            <a14:hiddenFill xmlns:a14="http://schemas.microsoft.com/office/drawing/2010/main">
+                              <a:solidFill>
+                                <a:srgbClr val="FFFFFF"/>
+                              </a:solidFill>
+                            </a14:hiddenFill>
+                          </a:ext>
+                          <a:ext uri="{91240B29-F687-4F45-9708-019B960494DF}">
+                            <a14:hiddenLine xmlns:a14="http://schemas.microsoft.com/office/drawing/2010/main" w="9525">
+                              <a:solidFill>
+                                <a:srgbClr val="000000"/>
+                              </a:solidFill>
+                              <a:miter lim="800000"/>
+                              <a:headEnd/>
+                              <a:tailEnd/>
+                            </a14:hiddenLine>
+                          </a:ext>
+                        </a:extLst>
+                      </wps:spPr>
+                      <wps:bodyPr rot="0" vert="horz" wrap="square" lIns="91440" tIns="45720" rIns="91440" bIns="45720" anchor="t" anchorCtr="0" upright="1">
+                        <a:noAutofit/>
+                      </wps:bodyPr>
+                    </wps:wsp>
+                  </a:graphicData>
+                </a:graphic>
+              </wp:inline>
+            </w:drawing>
+          </mc:Choice>
+          <mc:Fallback>
+            <w:pict>
+              <v:rect w14:anchorId="0CA65782" id="矩形 1" o:spid="_x0000_s1026" style="width:23.75pt;height:23.75pt;visibility:visible;mso-wrap-style:square;mso-left-percent:-10001;mso-top-percent:-10001;mso-position-horizontal:absolute;mso-position-horizontal-relative:char;mso-position-vertical:absolute;mso-position-vertical-relative:line;mso-left-percent:-10001;mso-top-percent:-10001;v-text-anchor:top" o:gfxdata="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" filled="f" stroked="f">
+                <o:lock v:ext="edit" aspectratio="t"/>
+                <w10:anchorlock/>
+              </v:rect>
+            </w:pict>
+          </mc:Fallback>
+        </mc:AlternateContent>
+      </w:r>
+    </w:p>
+    <w:p>
+      <w:pPr>
+        <w:widowControl/>
+        <w:pBdr>
+          <w:top w:val="single" w:sz="2" w:space="0" w:color="E5E7EB"/>
+          <w:left w:val="single" w:sz="2" w:space="0" w:color="E5E7EB"/>
+          <w:bottom w:val="single" w:sz="2" w:space="0" w:color="E5E7EB"/>
+          <w:right w:val="single" w:sz="2" w:space="0" w:color="E5E7EB"/>
+        </w:pBdr>
+        <w:shd w:val="clear" w:color="auto" w:fill="252526"/>
+        <w:spacing w:before="100" w:beforeAutospacing="1" w:after="100" w:afterAutospacing="1"/>
+        <w:ind w:left="720"/>
+        <w:jc w:val="left"/>
+        <w:rPr>
+          <w:rFonts w:ascii="Segoe UI" w:eastAsia="宋体" w:hAnsi="Segoe UI" w:cs="Segoe UI"/>
+          <w:color w:val="CCCCCC"/>
+          <w:kern w:val="0"/>
+          <w:sz w:val="20"/>
+          <w:szCs w:val="20"/>
+        </w:rPr>
+      </w:pPr>
+      <w:r>
+        <w:rPr>
+          <w:rFonts w:ascii="Segoe UI" w:eastAsia="宋体" w:hAnsi="Segoe UI" w:cs="Segoe UI"/>
+          <w:color w:val="CCCCCC"/>
+          <w:kern w:val="0"/>
+          <w:sz w:val="20"/>
+          <w:szCs w:val="20"/>
+          <w:bdr w:val="single" w:sz="2" w:space="0" w:color="E5E7EB" w:frame="1"/>
+        </w:rPr>
+        <w:t>tmp_sync_db.py</w:t>
+      </w:r>
+      <w:r>
+        <w:rPr>
+          <w:rFonts w:ascii="Segoe UI" w:eastAsia="宋体" w:hAnsi="Segoe UI" w:cs="Segoe UI"/>
+          <w:color w:val="CCCCCC"/>
+          <w:kern w:val="0"/>
+          <w:sz w:val="20"/>
+          <w:szCs w:val="20"/>
+        </w:rPr>
+        <w:t> </w:t>
+      </w:r>
+      <w:r>
+        <w:rPr>
+          <w:rFonts w:ascii="Segoe UI" w:eastAsia="宋体" w:hAnsi="Segoe UI" w:cs="Segoe UI"/>
+          <w:color w:val="CCCCCC"/>
+          <w:kern w:val="0"/>
+          <w:sz w:val="20"/>
+          <w:szCs w:val="20"/>
+        </w:rPr>
+        <w:t>仅为临时方案，后续需考虑更正式的迁移。</w:t>
+      </w:r>
+    </w:p>
+    <w:p>
+      <w:pPr>
+        <w:widowControl/>
+        <w:pBdr>
+          <w:top w:val="single" w:sz="2" w:space="0" w:color="E5E7EB"/>
+          <w:left w:val="single" w:sz="2" w:space="0" w:color="E5E7EB"/>
+          <w:bottom w:val="single" w:sz="2" w:space="0" w:color="E5E7EB"/>
+          <w:right w:val="single" w:sz="2" w:space="0" w:color="E5E7EB"/>
+        </w:pBdr>
+        <w:shd w:val="clear" w:color="auto" w:fill="252526"/>
+        <w:jc w:val="left"/>
+        <w:rPr>
+          <w:rFonts w:ascii="Segoe UI" w:eastAsia="宋体" w:hAnsi="Segoe UI" w:cs="Segoe UI"/>
+          <w:color w:val="CCCCCC"/>
+          <w:kern w:val="0"/>
+          <w:sz w:val="20"/>
+          <w:szCs w:val="20"/>
+        </w:rPr>
+      </w:pPr>
+      <w:r>
+        <w:rPr>
+          <w:rFonts w:ascii="Segoe UI" w:eastAsia="宋体" w:hAnsi="Segoe UI" w:cs="Segoe UI"/>
+          <w:b/>
+          <w:bCs/>
+          <w:color w:val="CCCCCC"/>
+          <w:kern w:val="0"/>
+          <w:sz w:val="20"/>
+          <w:szCs w:val="20"/>
+          <w:bdr w:val="single" w:sz="2" w:space="0" w:color="E5E7EB" w:frame="1"/>
+        </w:rPr>
+        <w:t xml:space="preserve">5. </w:t>
+      </w:r>
+      <w:r>
+        <w:rPr>
+          <w:rFonts w:ascii="Segoe UI" w:eastAsia="宋体" w:hAnsi="Segoe UI" w:cs="Segoe UI"/>
+          <w:b/>
+          <w:bCs/>
+          <w:color w:val="CCCCCC"/>
+          <w:kern w:val="0"/>
+          <w:sz w:val="20"/>
+          <w:szCs w:val="20"/>
+          <w:bdr w:val="single" w:sz="2" w:space="0" w:color="E5E7EB" w:frame="1"/>
+        </w:rPr>
+        <w:t>协作规则提醒</w:t>
+      </w:r>
+      <w:r>
+        <w:rPr>
+          <w:rFonts w:ascii="Segoe UI" w:eastAsia="宋体" w:hAnsi="Segoe UI" w:cs="Segoe UI"/>
+          <w:b/>
+          <w:bCs/>
+          <w:color w:val="CCCCCC"/>
+          <w:kern w:val="0"/>
+          <w:sz w:val="20"/>
+          <w:szCs w:val="20"/>
+          <w:bdr w:val="single" w:sz="2" w:space="0" w:color="E5E7EB" w:frame="1"/>
+        </w:rPr>
+        <w:t xml:space="preserve"> (Rules for AI)</w:t>
+      </w:r>
+    </w:p>
+    <w:p>
+      <w:pPr>
+        <w:widowControl/>
+        <w:numPr>
+          <w:ilvl w:val="0"/>
+          <w:numId w:val="6"/>
+        </w:numPr>
+        <w:pBdr>
+          <w:top w:val="single" w:sz="2" w:space="0" w:color="E5E7EB"/>
+          <w:left w:val="single" w:sz="2" w:space="0" w:color="E5E7EB"/>
+          <w:bottom w:val="single" w:sz="2" w:space="0" w:color="E5E7EB"/>
+          <w:right w:val="single" w:sz="2" w:space="0" w:color="E5E7EB"/>
+        </w:pBdr>
+        <w:shd w:val="clear" w:color="auto" w:fill="252526"/>
+        <w:spacing w:before="100" w:beforeAutospacing="1" w:after="100" w:afterAutospacing="1"/>
+        <w:jc w:val="left"/>
+        <w:rPr>
+          <w:rFonts w:ascii="Segoe UI" w:eastAsia="宋体" w:hAnsi="Segoe UI" w:cs="Segoe UI"/>
+          <w:color w:val="CCCCCC"/>
+          <w:kern w:val="0"/>
+          <w:sz w:val="20"/>
+          <w:szCs w:val="20"/>
+        </w:rPr>
+      </w:pPr>
+      <w:r>
+        <w:rPr>
+          <w:rFonts w:ascii="Segoe UI" w:eastAsia="宋体" w:hAnsi="Segoe UI" w:cs="Segoe UI"/>
+          <w:color w:val="CCCCCC"/>
+          <w:kern w:val="0"/>
+          <w:sz w:val="20"/>
+          <w:szCs w:val="20"/>
+        </w:rPr>
+        <w:t>所有回复、注释、计划必须使用</w:t>
+      </w:r>
+      <w:r>
+        <w:rPr>
+          <w:rFonts w:ascii="Segoe UI" w:eastAsia="宋体" w:hAnsi="Segoe UI" w:cs="Segoe UI"/>
+          <w:b/>
+          <w:bCs/>
+          <w:color w:val="CCCCCC"/>
+          <w:kern w:val="0"/>
+          <w:sz w:val="20"/>
+          <w:szCs w:val="20"/>
+          <w:bdr w:val="single" w:sz="2" w:space="0" w:color="E5E7EB" w:frame="1"/>
+        </w:rPr>
+        <w:t>简体中文</w:t>
+      </w:r>
+      <w:r>
+        <w:rPr>
+          <w:rFonts w:ascii="Segoe UI" w:eastAsia="宋体" w:hAnsi="Segoe UI" w:cs="Segoe UI"/>
+          <w:color w:val="CCCCCC"/>
+          <w:kern w:val="0"/>
+          <w:sz w:val="20"/>
+          <w:szCs w:val="20"/>
+        </w:rPr>
+        <w:t>。</w:t>
+      </w:r>
+    </w:p>
+    <w:p>
+      <w:pPr>
+        <w:widowControl/>
+        <w:numPr>
+          <w:ilvl w:val="0"/>
+          <w:numId w:val="6"/>
+        </w:numPr>
+        <w:pBdr>
+          <w:top w:val="single" w:sz="2" w:space="0" w:color="E5E7EB"/>
+          <w:left w:val="single" w:sz="2" w:space="0" w:color="E5E7EB"/>
+          <w:bottom w:val="single" w:sz="2" w:space="0" w:color="E5E7EB"/>
+          <w:right w:val="single" w:sz="2" w:space="0" w:color="E5E7EB"/>
+        </w:pBdr>
+        <w:shd w:val="clear" w:color="auto" w:fill="252526"/>
+        <w:spacing w:before="100" w:beforeAutospacing="1" w:after="100" w:afterAutospacing="1"/>
+        <w:jc w:val="left"/>
+        <w:rPr>
+          <w:rFonts w:ascii="Segoe UI" w:eastAsia="宋体" w:hAnsi="Segoe UI" w:cs="Segoe UI"/>
+          <w:color w:val="CCCCCC"/>
+          <w:kern w:val="0"/>
+          <w:sz w:val="20"/>
+          <w:szCs w:val="20"/>
+        </w:rPr>
+      </w:pPr>
+      <w:r>
+        <w:rPr>
+          <w:rFonts w:ascii="Segoe UI" w:eastAsia="宋体" w:hAnsi="Segoe UI" w:cs="Segoe UI"/>
+          <w:color w:val="CCCCCC"/>
+          <w:kern w:val="0"/>
+          <w:sz w:val="20"/>
+          <w:szCs w:val="20"/>
+        </w:rPr>
+        <w:t xml:space="preserve">UI </w:t>
+      </w:r>
+      <w:r>
+        <w:rPr>
+          <w:rFonts w:ascii="Segoe UI" w:eastAsia="宋体" w:hAnsi="Segoe UI" w:cs="Segoe UI"/>
+          <w:color w:val="CCCCCC"/>
+          <w:kern w:val="0"/>
+          <w:sz w:val="20"/>
+          <w:szCs w:val="20"/>
+        </w:rPr>
+        <w:t>必须符合</w:t>
+      </w:r>
+      <w:r>
+        <w:rPr>
+          <w:rFonts w:ascii="Segoe UI" w:eastAsia="宋体" w:hAnsi="Segoe UI" w:cs="Segoe UI"/>
+          <w:color w:val="CCCCCC"/>
+          <w:kern w:val="0"/>
+          <w:sz w:val="20"/>
+          <w:szCs w:val="20"/>
+        </w:rPr>
+        <w:t> </w:t>
+      </w:r>
+      <w:r>
+        <w:rPr>
+          <w:rFonts w:ascii="Segoe UI" w:eastAsia="宋体" w:hAnsi="Segoe UI" w:cs="Segoe UI"/>
+          <w:b/>
+          <w:bCs/>
+          <w:color w:val="CCCCCC"/>
+          <w:kern w:val="0"/>
+          <w:sz w:val="20"/>
+          <w:szCs w:val="20"/>
+          <w:bdr w:val="single" w:sz="2" w:space="0" w:color="E5E7EB" w:frame="1"/>
+        </w:rPr>
+        <w:t xml:space="preserve">WOW </w:t>
+      </w:r>
+      <w:r>
+        <w:rPr>
+          <w:rFonts w:ascii="Segoe UI" w:eastAsia="宋体" w:hAnsi="Segoe UI" w:cs="Segoe UI"/>
+          <w:b/>
+          <w:bCs/>
+          <w:color w:val="CCCCCC"/>
+          <w:kern w:val="0"/>
+          <w:sz w:val="20"/>
+          <w:szCs w:val="20"/>
+          <w:bdr w:val="single" w:sz="2" w:space="0" w:color="E5E7EB" w:frame="1"/>
+        </w:rPr>
+        <w:t>视觉标准</w:t>
+      </w:r>
+      <w:r>
+        <w:rPr>
+          <w:rFonts w:ascii="Segoe UI" w:eastAsia="宋体" w:hAnsi="Segoe UI" w:cs="Segoe UI"/>
+          <w:color w:val="CCCCCC"/>
+          <w:kern w:val="0"/>
+          <w:sz w:val="20"/>
+          <w:szCs w:val="20"/>
+        </w:rPr>
+        <w:t>（</w:t>
+      </w:r>
+      <w:r>
+        <w:rPr>
+          <w:rFonts w:ascii="Segoe UI" w:eastAsia="宋体" w:hAnsi="Segoe UI" w:cs="Segoe UI"/>
+          <w:color w:val="CCCCCC"/>
+          <w:kern w:val="0"/>
+          <w:sz w:val="20"/>
+          <w:szCs w:val="20"/>
+        </w:rPr>
+        <w:t xml:space="preserve">iOS </w:t>
+      </w:r>
+      <w:r>
+        <w:rPr>
+          <w:rFonts w:ascii="Segoe UI" w:eastAsia="宋体" w:hAnsi="Segoe UI" w:cs="Segoe UI"/>
+          <w:color w:val="CCCCCC"/>
+          <w:kern w:val="0"/>
+          <w:sz w:val="20"/>
+          <w:szCs w:val="20"/>
+        </w:rPr>
+        <w:t>动效、玻璃拟态、精致间距）。</w:t>
+      </w:r>
+    </w:p>
+    <w:p>
+      <w:pPr>
+        <w:widowControl/>
+        <w:numPr>
+          <w:ilvl w:val="0"/>
+          <w:numId w:val="6"/>
+        </w:numPr>
+        <w:pBdr>
+          <w:top w:val="single" w:sz="2" w:space="0" w:color="E5E7EB"/>
+          <w:left w:val="single" w:sz="2" w:space="0" w:color="E5E7EB"/>
+          <w:bottom w:val="single" w:sz="2" w:space="0" w:color="E5E7EB"/>
+          <w:right w:val="single" w:sz="2" w:space="0" w:color="E5E7EB"/>
+        </w:pBdr>
+        <w:shd w:val="clear" w:color="auto" w:fill="252526"/>
+        <w:spacing w:before="100" w:beforeAutospacing="1" w:after="100" w:afterAutospacing="1"/>
+        <w:jc w:val="left"/>
+        <w:rPr>
+          <w:rFonts w:ascii="Segoe UI" w:eastAsia="宋体" w:hAnsi="Segoe UI" w:cs="Segoe UI"/>
+          <w:color w:val="CCCCCC"/>
+          <w:kern w:val="0"/>
+          <w:sz w:val="20"/>
+          <w:szCs w:val="20"/>
+        </w:rPr>
+      </w:pPr>
+      <w:r>
+        <w:rPr>
+          <w:rFonts w:ascii="Segoe UI" w:eastAsia="宋体" w:hAnsi="Segoe UI" w:cs="Segoe UI"/>
+          <w:color w:val="CCCCCC"/>
+          <w:kern w:val="0"/>
+          <w:sz w:val="20"/>
+          <w:szCs w:val="20"/>
+        </w:rPr>
+        <w:t>代码需遵循</w:t>
+      </w:r>
+      <w:r>
+        <w:rPr>
+          <w:rFonts w:ascii="Segoe UI" w:eastAsia="宋体" w:hAnsi="Segoe UI" w:cs="Segoe UI"/>
+          <w:color w:val="CCCCCC"/>
+          <w:kern w:val="0"/>
+          <w:sz w:val="20"/>
+          <w:szCs w:val="20"/>
+        </w:rPr>
+        <w:t> </w:t>
+      </w:r>
+      <w:r>
+        <w:rPr>
+          <w:rFonts w:ascii="Consolas" w:eastAsia="宋体" w:hAnsi="Consolas" w:cs="宋体"/>
+          <w:color w:val="D0D0D0"/>
+          <w:kern w:val="0"/>
+          <w:sz w:val="18"/>
+          <w:szCs w:val="18"/>
+          <w:bdr w:val="single" w:sz="2" w:space="0" w:color="E5E7EB" w:frame="1"/>
+          <w:shd w:val="clear" w:color="auto" w:fill="3C3C3C"/>
+        </w:rPr>
+        <w:t>camelCase</w:t>
+      </w:r>
+      <w:r>
+        <w:rPr>
+          <w:rFonts w:ascii="Segoe UI" w:eastAsia="宋体" w:hAnsi="Segoe UI" w:cs="Segoe UI"/>
+          <w:color w:val="CCCCCC"/>
+          <w:kern w:val="0"/>
+          <w:sz w:val="20"/>
+          <w:szCs w:val="20"/>
+        </w:rPr>
+        <w:t xml:space="preserve"> (JS/TS) </w:t>
+      </w:r>
+      <w:r>
+        <w:rPr>
+          <w:rFonts w:ascii="Segoe UI" w:eastAsia="宋体" w:hAnsi="Segoe UI" w:cs="Segoe UI"/>
+          <w:color w:val="CCCCCC"/>
+          <w:kern w:val="0"/>
+          <w:sz w:val="20"/>
+          <w:szCs w:val="20"/>
+        </w:rPr>
+        <w:t>和</w:t>
+      </w:r>
+      <w:r>
+        <w:rPr>
+          <w:rFonts w:ascii="Segoe UI" w:eastAsia="宋体" w:hAnsi="Segoe UI" w:cs="Segoe UI"/>
+          <w:color w:val="CCCCCC"/>
+          <w:kern w:val="0"/>
+          <w:sz w:val="20"/>
+          <w:szCs w:val="20"/>
+        </w:rPr>
+        <w:t> </w:t>
+      </w:r>
+      <w:r>
+        <w:rPr>
+          <w:rFonts w:ascii="Consolas" w:eastAsia="宋体" w:hAnsi="Consolas" w:cs="宋体"/>
+          <w:color w:val="D0D0D0"/>
+          <w:kern w:val="0"/>
+          <w:sz w:val="18"/>
+          <w:szCs w:val="18"/>
+          <w:bdr w:val="single" w:sz="2" w:space="0" w:color="E5E7EB" w:frame="1"/>
+          <w:shd w:val="clear" w:color="auto" w:fill="3C3C3C"/>
+        </w:rPr>
+        <w:t>snake_case</w:t>
+      </w:r>
+      <w:r>
+        <w:rPr>
+          <w:rFonts w:ascii="Segoe UI" w:eastAsia="宋体" w:hAnsi="Segoe UI" w:cs="Segoe UI"/>
+          <w:color w:val="CCCCCC"/>
+          <w:kern w:val="0"/>
+          <w:sz w:val="20"/>
+          <w:szCs w:val="20"/>
+        </w:rPr>
+        <w:t xml:space="preserve"> (Python) </w:t>
+      </w:r>
+      <w:r>
+        <w:rPr>
+          <w:rFonts w:ascii="Segoe UI" w:eastAsia="宋体" w:hAnsi="Segoe UI" w:cs="Segoe UI"/>
+          <w:color w:val="CCCCCC"/>
+          <w:kern w:val="0"/>
+          <w:sz w:val="20"/>
+          <w:szCs w:val="20"/>
+        </w:rPr>
+        <w:t>规范。</w:t>
+      </w:r>
+    </w:p>
+    <w:p>
+      <w:pPr>
+        <w:widowControl/>
+        <w:numPr>
+          <w:ilvl w:val="0"/>
+          <w:numId w:val="6"/>
+        </w:numPr>
+        <w:pBdr>
+          <w:top w:val="single" w:sz="2" w:space="0" w:color="E5E7EB"/>
+          <w:left w:val="single" w:sz="2" w:space="0" w:color="E5E7EB"/>
+          <w:bottom w:val="single" w:sz="2" w:space="0" w:color="E5E7EB"/>
+          <w:right w:val="single" w:sz="2" w:space="0" w:color="E5E7EB"/>
+        </w:pBdr>
+        <w:shd w:val="clear" w:color="auto" w:fill="252526"/>
+        <w:spacing w:before="100" w:beforeAutospacing="1" w:after="100" w:afterAutospacing="1"/>
+        <w:jc w:val="left"/>
+        <w:rPr>
+          <w:rFonts w:ascii="Segoe UI" w:eastAsia="宋体" w:hAnsi="Segoe UI" w:cs="Segoe UI"/>
+          <w:color w:val="CCCCCC"/>
+          <w:kern w:val="0"/>
+          <w:sz w:val="20"/>
+          <w:szCs w:val="20"/>
+        </w:rPr>
+      </w:pPr>
+      <w:r>
+        <w:rPr>
+          <w:rFonts w:ascii="Segoe UI" w:eastAsia="宋体" w:hAnsi="Segoe UI" w:cs="Segoe UI"/>
+          <w:color w:val="CCCCCC"/>
+          <w:kern w:val="0"/>
+          <w:sz w:val="20"/>
+          <w:szCs w:val="20"/>
+        </w:rPr>
+        <w:t>修改代码前需先调用</w:t>
+      </w:r>
+      <w:r>
+        <w:rPr>
+          <w:rFonts w:ascii="Segoe UI" w:eastAsia="宋体" w:hAnsi="Segoe UI" w:cs="Segoe UI"/>
+          <w:color w:val="CCCCCC"/>
+          <w:kern w:val="0"/>
+          <w:sz w:val="20"/>
+          <w:szCs w:val="20"/>
+        </w:rPr>
+        <w:t> </w:t>
+      </w:r>
+      <w:r>
+        <w:rPr>
+          <w:rFonts w:ascii="Consolas" w:eastAsia="宋体" w:hAnsi="Consolas" w:cs="宋体"/>
+          <w:color w:val="D0D0D0"/>
+          <w:kern w:val="0"/>
+          <w:sz w:val="18"/>
+          <w:szCs w:val="18"/>
+          <w:bdr w:val="single" w:sz="2" w:space="0" w:color="E5E7EB" w:frame="1"/>
+          <w:shd w:val="clear" w:color="auto" w:fill="3C3C3C"/>
+        </w:rPr>
+        <w:t>view_file</w:t>
+      </w:r>
+      <w:r>
+        <w:rPr>
+          <w:rFonts w:ascii="Segoe UI" w:eastAsia="宋体" w:hAnsi="Segoe UI" w:cs="Segoe UI"/>
+          <w:color w:val="CCCCCC"/>
+          <w:kern w:val="0"/>
+          <w:sz w:val="20"/>
+          <w:szCs w:val="20"/>
+        </w:rPr>
+        <w:t> </w:t>
+      </w:r>
+      <w:r>
+        <w:rPr>
+          <w:rFonts w:ascii="Segoe UI" w:eastAsia="宋体" w:hAnsi="Segoe UI" w:cs="Segoe UI"/>
+          <w:color w:val="CCCCCC"/>
+          <w:kern w:val="0"/>
+          <w:sz w:val="20"/>
+          <w:szCs w:val="20"/>
+        </w:rPr>
+        <w:t>确认当前逻辑，避免重复编写。</w:t>
+      </w:r>
+    </w:p>
+    <w:p>
+      <w:pPr>
+        <w:widowControl/>
+        <w:pBdr>
+          <w:top w:val="single" w:sz="2" w:space="0" w:color="E5E7EB"/>
+          <w:left w:val="single" w:sz="2" w:space="0" w:color="E5E7EB"/>
+          <w:bottom w:val="single" w:sz="2" w:space="0" w:color="E5E7EB"/>
+          <w:right w:val="single" w:sz="2" w:space="0" w:color="E5E7EB"/>
+        </w:pBdr>
+        <w:shd w:val="clear" w:color="auto" w:fill="252526"/>
+        <w:spacing w:before="100" w:beforeAutospacing="1" w:after="100" w:afterAutospacing="1"/>
+        <w:jc w:val="left"/>
+        <w:rPr>
+          <w:rFonts w:ascii="Segoe UI" w:eastAsia="宋体" w:hAnsi="Segoe UI" w:cs="Segoe UI" w:hint="eastAsia"/>
+          <w:color w:val="CCCCCC"/>
+          <w:kern w:val="0"/>
+          <w:sz w:val="20"/>
+          <w:szCs w:val="20"/>
+        </w:rPr>
+      </w:pPr>
+      <w:r>
+        <w:rPr>
+          <w:rFonts w:ascii="Segoe UI" w:hAnsi="Segoe UI" w:cs="Segoe UI"/>
+          <w:color w:val="CCCCCC"/>
+          <w:sz w:val="20"/>
+          <w:szCs w:val="20"/>
+          <w:shd w:val="clear" w:color="auto" w:fill="252526"/>
+        </w:rPr>
+        <w:t>这是</w:t>
+      </w:r>
+      <w:r>
+        <w:rPr>
+          <w:rFonts w:ascii="Segoe UI" w:hAnsi="Segoe UI" w:cs="Segoe UI"/>
+          <w:color w:val="CCCCCC"/>
+          <w:sz w:val="20"/>
+          <w:szCs w:val="20"/>
+          <w:shd w:val="clear" w:color="auto" w:fill="252526"/>
+        </w:rPr>
+        <w:t xml:space="preserve"> Hive </w:t>
+      </w:r>
+      <w:r>
+        <w:rPr>
+          <w:rFonts w:ascii="Segoe UI" w:hAnsi="Segoe UI" w:cs="Segoe UI"/>
+          <w:color w:val="CCCCCC"/>
+          <w:sz w:val="20"/>
+          <w:szCs w:val="20"/>
+          <w:shd w:val="clear" w:color="auto" w:fill="252526"/>
+        </w:rPr>
+        <w:t>项目的最新状态，请阅读并准备好进行下一步开发。</w:t>
       </w:r>
     </w:p>
     <w:p/>
@@ -479,6 +2892,155 @@
 <file path=word/numbering.xml><?xml version="1.0" encoding="utf-8"?>
 <w:numbering xmlns:wpc="http://schemas.microsoft.com/office/word/2010/wordprocessingCanvas" xmlns:cx="http://schemas.microsoft.com/office/drawing/2014/chartex" xmlns:cx1="http://schemas.microsoft.com/office/drawing/2015/9/8/chartex" xmlns:cx2="http://schemas.microsoft.com/office/drawing/2015/10/21/chartex" xmlns:cx3="http://schemas.microsoft.com/office/drawing/2016/5/9/chartex" xmlns:cx4="http://schemas.microsoft.com/office/drawing/2016/5/10/chartex" xmlns:cx5="http://schemas.microsoft.com/office/drawing/2016/5/11/chartex" xmlns:cx6="http://schemas.microsoft.com/office/drawing/2016/5/12/chartex" xmlns:cx7="http://schemas.microsoft.com/office/drawing/2016/5/13/chartex" xmlns:cx8="http://schemas.microsoft.com/office/drawing/2016/5/14/chartex" xmlns:mc="http://schemas.openxmlformats.org/markup-compatibility/2006" xmlns:aink="http://schemas.microsoft.com/office/drawing/2016/ink" xmlns:am3d="http://schemas.microsoft.com/office/drawing/2017/model3d" xmlns:o="urn:schemas-microsoft-com:office:office" xmlns:oel="http://schemas.microsoft.com/office/2019/extlst" xmlns:r="http://schemas.openxmlformats.org/officeDocument/2006/relationships" xmlns:m="http://schemas.openxmlformats.org/officeDocument/2006/math" xmlns:v="urn:schemas-microsoft-com:vml" xmlns:wp14="http://schemas.microsoft.com/office/word/2010/wordprocessingDrawing" xmlns:wp="http://schemas.openxmlformats.org/drawingml/2006/wordprocessingDrawing" xmlns:w10="urn:schemas-microsoft-com:office:word" xmlns:w="http://schemas.openxmlformats.org/wordprocessingml/2006/main" xmlns:w14="http://schemas.microsoft.com/office/word/2010/wordml" xmlns:w15="http://schemas.microsoft.com/office/word/2012/wordml" xmlns:w16cex="http://schemas.microsoft.com/office/word/2018/wordml/cex" xmlns:w16cid="http://schemas.microsoft.com/office/word/2016/wordml/cid" xmlns:w16="http://schemas.microsoft.com/office/word/2018/wordml" xmlns:w16du="http://schemas.microsoft.com/office/word/2023/wordml/word16du" xmlns:w16sdtdh="http://schemas.microsoft.com/office/word/2020/wordml/sdtdatahash" xmlns:w16se="http://schemas.microsoft.com/office/word/2015/wordml/symex" xmlns:wpg="http://schemas.microsoft.com/office/word/2010/wordprocessingGroup" xmlns:wpi="http://schemas.microsoft.com/office/word/2010/wordprocessingInk" xmlns:wne="http://schemas.microsoft.com/office/word/2006/wordml" xmlns:wps="http://schemas.microsoft.com/office/word/2010/wordprocessingShape" mc:Ignorable="w14 w15 w16se w16cid w16 w16cex w16sdtdh w16du wp14">
   <w:abstractNum w:abstractNumId="0" w15:restartNumberingAfterBreak="0">
+    <w:nsid w:val="06092810"/>
+    <w:multiLevelType w:val="multilevel"/>
+    <w:tmpl w:val="6A06E45A"/>
+    <w:lvl w:ilvl="0">
+      <w:start w:val="1"/>
+      <w:numFmt w:val="bullet"/>
+      <w:lvlText w:val=""/>
+      <w:lvlJc w:val="left"/>
+      <w:pPr>
+        <w:tabs>
+          <w:tab w:val="num" w:pos="720"/>
+        </w:tabs>
+        <w:ind w:left="720" w:hanging="360"/>
+      </w:pPr>
+      <w:rPr>
+        <w:rFonts w:ascii="Symbol" w:hAnsi="Symbol" w:hint="default"/>
+        <w:sz w:val="20"/>
+      </w:rPr>
+    </w:lvl>
+    <w:lvl w:ilvl="1">
+      <w:start w:val="1"/>
+      <w:numFmt w:val="bullet"/>
+      <w:lvlText w:val=""/>
+      <w:lvlJc w:val="left"/>
+      <w:pPr>
+        <w:tabs>
+          <w:tab w:val="num" w:pos="1440"/>
+        </w:tabs>
+        <w:ind w:left="1440" w:hanging="360"/>
+      </w:pPr>
+      <w:rPr>
+        <w:rFonts w:ascii="Symbol" w:hAnsi="Symbol" w:hint="default"/>
+        <w:sz w:val="20"/>
+      </w:rPr>
+    </w:lvl>
+    <w:lvl w:ilvl="2" w:tentative="1">
+      <w:start w:val="1"/>
+      <w:numFmt w:val="bullet"/>
+      <w:lvlText w:val=""/>
+      <w:lvlJc w:val="left"/>
+      <w:pPr>
+        <w:tabs>
+          <w:tab w:val="num" w:pos="2160"/>
+        </w:tabs>
+        <w:ind w:left="2160" w:hanging="360"/>
+      </w:pPr>
+      <w:rPr>
+        <w:rFonts w:ascii="Symbol" w:hAnsi="Symbol" w:hint="default"/>
+        <w:sz w:val="20"/>
+      </w:rPr>
+    </w:lvl>
+    <w:lvl w:ilvl="3" w:tentative="1">
+      <w:start w:val="1"/>
+      <w:numFmt w:val="bullet"/>
+      <w:lvlText w:val=""/>
+      <w:lvlJc w:val="left"/>
+      <w:pPr>
+        <w:tabs>
+          <w:tab w:val="num" w:pos="2880"/>
+        </w:tabs>
+        <w:ind w:left="2880" w:hanging="360"/>
+      </w:pPr>
+      <w:rPr>
+        <w:rFonts w:ascii="Symbol" w:hAnsi="Symbol" w:hint="default"/>
+        <w:sz w:val="20"/>
+      </w:rPr>
+    </w:lvl>
+    <w:lvl w:ilvl="4" w:tentative="1">
+      <w:start w:val="1"/>
+      <w:numFmt w:val="bullet"/>
+      <w:lvlText w:val=""/>
+      <w:lvlJc w:val="left"/>
+      <w:pPr>
+        <w:tabs>
+          <w:tab w:val="num" w:pos="3600"/>
+        </w:tabs>
+        <w:ind w:left="3600" w:hanging="360"/>
+      </w:pPr>
+      <w:rPr>
+        <w:rFonts w:ascii="Symbol" w:hAnsi="Symbol" w:hint="default"/>
+        <w:sz w:val="20"/>
+      </w:rPr>
+    </w:lvl>
+    <w:lvl w:ilvl="5" w:tentative="1">
+      <w:start w:val="1"/>
+      <w:numFmt w:val="bullet"/>
+      <w:lvlText w:val=""/>
+      <w:lvlJc w:val="left"/>
+      <w:pPr>
+        <w:tabs>
+          <w:tab w:val="num" w:pos="4320"/>
+        </w:tabs>
+        <w:ind w:left="4320" w:hanging="360"/>
+      </w:pPr>
+      <w:rPr>
+        <w:rFonts w:ascii="Symbol" w:hAnsi="Symbol" w:hint="default"/>
+        <w:sz w:val="20"/>
+      </w:rPr>
+    </w:lvl>
+    <w:lvl w:ilvl="6" w:tentative="1">
+      <w:start w:val="1"/>
+      <w:numFmt w:val="bullet"/>
+      <w:lvlText w:val=""/>
+      <w:lvlJc w:val="left"/>
+      <w:pPr>
+        <w:tabs>
+          <w:tab w:val="num" w:pos="5040"/>
+        </w:tabs>
+        <w:ind w:left="5040" w:hanging="360"/>
+      </w:pPr>
+      <w:rPr>
+        <w:rFonts w:ascii="Symbol" w:hAnsi="Symbol" w:hint="default"/>
+        <w:sz w:val="20"/>
+      </w:rPr>
+    </w:lvl>
+    <w:lvl w:ilvl="7" w:tentative="1">
+      <w:start w:val="1"/>
+      <w:numFmt w:val="bullet"/>
+      <w:lvlText w:val=""/>
+      <w:lvlJc w:val="left"/>
+      <w:pPr>
+        <w:tabs>
+          <w:tab w:val="num" w:pos="5760"/>
+        </w:tabs>
+        <w:ind w:left="5760" w:hanging="360"/>
+      </w:pPr>
+      <w:rPr>
+        <w:rFonts w:ascii="Symbol" w:hAnsi="Symbol" w:hint="default"/>
+        <w:sz w:val="20"/>
+      </w:rPr>
+    </w:lvl>
+    <w:lvl w:ilvl="8" w:tentative="1">
+      <w:start w:val="1"/>
+      <w:numFmt w:val="bullet"/>
+      <w:lvlText w:val=""/>
+      <w:lvlJc w:val="left"/>
+      <w:pPr>
+        <w:tabs>
+          <w:tab w:val="num" w:pos="6480"/>
+        </w:tabs>
+        <w:ind w:left="6480" w:hanging="360"/>
+      </w:pPr>
+      <w:rPr>
+        <w:rFonts w:ascii="Symbol" w:hAnsi="Symbol" w:hint="default"/>
+        <w:sz w:val="20"/>
+      </w:rPr>
+    </w:lvl>
+  </w:abstractNum>
+  <w:abstractNum w:abstractNumId="1" w15:restartNumberingAfterBreak="0">
     <w:nsid w:val="19B203BE"/>
     <w:multiLevelType w:val="multilevel"/>
     <w:tmpl w:val="7C543F02"/>
@@ -591,8 +3153,619 @@
       </w:pPr>
     </w:lvl>
   </w:abstractNum>
+  <w:abstractNum w:abstractNumId="2" w15:restartNumberingAfterBreak="0">
+    <w:nsid w:val="425F65DA"/>
+    <w:multiLevelType w:val="multilevel"/>
+    <w:tmpl w:val="49721D02"/>
+    <w:lvl w:ilvl="0">
+      <w:start w:val="1"/>
+      <w:numFmt w:val="bullet"/>
+      <w:lvlText w:val=""/>
+      <w:lvlJc w:val="left"/>
+      <w:pPr>
+        <w:tabs>
+          <w:tab w:val="num" w:pos="720"/>
+        </w:tabs>
+        <w:ind w:left="720" w:hanging="360"/>
+      </w:pPr>
+      <w:rPr>
+        <w:rFonts w:ascii="Symbol" w:hAnsi="Symbol" w:hint="default"/>
+        <w:sz w:val="20"/>
+      </w:rPr>
+    </w:lvl>
+    <w:lvl w:ilvl="1" w:tentative="1">
+      <w:start w:val="1"/>
+      <w:numFmt w:val="bullet"/>
+      <w:lvlText w:val=""/>
+      <w:lvlJc w:val="left"/>
+      <w:pPr>
+        <w:tabs>
+          <w:tab w:val="num" w:pos="1440"/>
+        </w:tabs>
+        <w:ind w:left="1440" w:hanging="360"/>
+      </w:pPr>
+      <w:rPr>
+        <w:rFonts w:ascii="Symbol" w:hAnsi="Symbol" w:hint="default"/>
+        <w:sz w:val="20"/>
+      </w:rPr>
+    </w:lvl>
+    <w:lvl w:ilvl="2" w:tentative="1">
+      <w:start w:val="1"/>
+      <w:numFmt w:val="bullet"/>
+      <w:lvlText w:val=""/>
+      <w:lvlJc w:val="left"/>
+      <w:pPr>
+        <w:tabs>
+          <w:tab w:val="num" w:pos="2160"/>
+        </w:tabs>
+        <w:ind w:left="2160" w:hanging="360"/>
+      </w:pPr>
+      <w:rPr>
+        <w:rFonts w:ascii="Symbol" w:hAnsi="Symbol" w:hint="default"/>
+        <w:sz w:val="20"/>
+      </w:rPr>
+    </w:lvl>
+    <w:lvl w:ilvl="3" w:tentative="1">
+      <w:start w:val="1"/>
+      <w:numFmt w:val="bullet"/>
+      <w:lvlText w:val=""/>
+      <w:lvlJc w:val="left"/>
+      <w:pPr>
+        <w:tabs>
+          <w:tab w:val="num" w:pos="2880"/>
+        </w:tabs>
+        <w:ind w:left="2880" w:hanging="360"/>
+      </w:pPr>
+      <w:rPr>
+        <w:rFonts w:ascii="Symbol" w:hAnsi="Symbol" w:hint="default"/>
+        <w:sz w:val="20"/>
+      </w:rPr>
+    </w:lvl>
+    <w:lvl w:ilvl="4" w:tentative="1">
+      <w:start w:val="1"/>
+      <w:numFmt w:val="bullet"/>
+      <w:lvlText w:val=""/>
+      <w:lvlJc w:val="left"/>
+      <w:pPr>
+        <w:tabs>
+          <w:tab w:val="num" w:pos="3600"/>
+        </w:tabs>
+        <w:ind w:left="3600" w:hanging="360"/>
+      </w:pPr>
+      <w:rPr>
+        <w:rFonts w:ascii="Symbol" w:hAnsi="Symbol" w:hint="default"/>
+        <w:sz w:val="20"/>
+      </w:rPr>
+    </w:lvl>
+    <w:lvl w:ilvl="5" w:tentative="1">
+      <w:start w:val="1"/>
+      <w:numFmt w:val="bullet"/>
+      <w:lvlText w:val=""/>
+      <w:lvlJc w:val="left"/>
+      <w:pPr>
+        <w:tabs>
+          <w:tab w:val="num" w:pos="4320"/>
+        </w:tabs>
+        <w:ind w:left="4320" w:hanging="360"/>
+      </w:pPr>
+      <w:rPr>
+        <w:rFonts w:ascii="Symbol" w:hAnsi="Symbol" w:hint="default"/>
+        <w:sz w:val="20"/>
+      </w:rPr>
+    </w:lvl>
+    <w:lvl w:ilvl="6" w:tentative="1">
+      <w:start w:val="1"/>
+      <w:numFmt w:val="bullet"/>
+      <w:lvlText w:val=""/>
+      <w:lvlJc w:val="left"/>
+      <w:pPr>
+        <w:tabs>
+          <w:tab w:val="num" w:pos="5040"/>
+        </w:tabs>
+        <w:ind w:left="5040" w:hanging="360"/>
+      </w:pPr>
+      <w:rPr>
+        <w:rFonts w:ascii="Symbol" w:hAnsi="Symbol" w:hint="default"/>
+        <w:sz w:val="20"/>
+      </w:rPr>
+    </w:lvl>
+    <w:lvl w:ilvl="7" w:tentative="1">
+      <w:start w:val="1"/>
+      <w:numFmt w:val="bullet"/>
+      <w:lvlText w:val=""/>
+      <w:lvlJc w:val="left"/>
+      <w:pPr>
+        <w:tabs>
+          <w:tab w:val="num" w:pos="5760"/>
+        </w:tabs>
+        <w:ind w:left="5760" w:hanging="360"/>
+      </w:pPr>
+      <w:rPr>
+        <w:rFonts w:ascii="Symbol" w:hAnsi="Symbol" w:hint="default"/>
+        <w:sz w:val="20"/>
+      </w:rPr>
+    </w:lvl>
+    <w:lvl w:ilvl="8" w:tentative="1">
+      <w:start w:val="1"/>
+      <w:numFmt w:val="bullet"/>
+      <w:lvlText w:val=""/>
+      <w:lvlJc w:val="left"/>
+      <w:pPr>
+        <w:tabs>
+          <w:tab w:val="num" w:pos="6480"/>
+        </w:tabs>
+        <w:ind w:left="6480" w:hanging="360"/>
+      </w:pPr>
+      <w:rPr>
+        <w:rFonts w:ascii="Symbol" w:hAnsi="Symbol" w:hint="default"/>
+        <w:sz w:val="20"/>
+      </w:rPr>
+    </w:lvl>
+  </w:abstractNum>
+  <w:abstractNum w:abstractNumId="3" w15:restartNumberingAfterBreak="0">
+    <w:nsid w:val="51DB7B4E"/>
+    <w:multiLevelType w:val="multilevel"/>
+    <w:tmpl w:val="45C03B50"/>
+    <w:lvl w:ilvl="0">
+      <w:start w:val="1"/>
+      <w:numFmt w:val="bullet"/>
+      <w:lvlText w:val=""/>
+      <w:lvlJc w:val="left"/>
+      <w:pPr>
+        <w:tabs>
+          <w:tab w:val="num" w:pos="720"/>
+        </w:tabs>
+        <w:ind w:left="720" w:hanging="360"/>
+      </w:pPr>
+      <w:rPr>
+        <w:rFonts w:ascii="Symbol" w:hAnsi="Symbol" w:hint="default"/>
+        <w:sz w:val="20"/>
+      </w:rPr>
+    </w:lvl>
+    <w:lvl w:ilvl="1" w:tentative="1">
+      <w:start w:val="1"/>
+      <w:numFmt w:val="bullet"/>
+      <w:lvlText w:val="o"/>
+      <w:lvlJc w:val="left"/>
+      <w:pPr>
+        <w:tabs>
+          <w:tab w:val="num" w:pos="1440"/>
+        </w:tabs>
+        <w:ind w:left="1440" w:hanging="360"/>
+      </w:pPr>
+      <w:rPr>
+        <w:rFonts w:ascii="Courier New" w:hAnsi="Courier New" w:hint="default"/>
+        <w:sz w:val="20"/>
+      </w:rPr>
+    </w:lvl>
+    <w:lvl w:ilvl="2" w:tentative="1">
+      <w:start w:val="1"/>
+      <w:numFmt w:val="bullet"/>
+      <w:lvlText w:val=""/>
+      <w:lvlJc w:val="left"/>
+      <w:pPr>
+        <w:tabs>
+          <w:tab w:val="num" w:pos="2160"/>
+        </w:tabs>
+        <w:ind w:left="2160" w:hanging="360"/>
+      </w:pPr>
+      <w:rPr>
+        <w:rFonts w:ascii="Wingdings" w:hAnsi="Wingdings" w:hint="default"/>
+        <w:sz w:val="20"/>
+      </w:rPr>
+    </w:lvl>
+    <w:lvl w:ilvl="3" w:tentative="1">
+      <w:start w:val="1"/>
+      <w:numFmt w:val="bullet"/>
+      <w:lvlText w:val=""/>
+      <w:lvlJc w:val="left"/>
+      <w:pPr>
+        <w:tabs>
+          <w:tab w:val="num" w:pos="2880"/>
+        </w:tabs>
+        <w:ind w:left="2880" w:hanging="360"/>
+      </w:pPr>
+      <w:rPr>
+        <w:rFonts w:ascii="Wingdings" w:hAnsi="Wingdings" w:hint="default"/>
+        <w:sz w:val="20"/>
+      </w:rPr>
+    </w:lvl>
+    <w:lvl w:ilvl="4" w:tentative="1">
+      <w:start w:val="1"/>
+      <w:numFmt w:val="bullet"/>
+      <w:lvlText w:val=""/>
+      <w:lvlJc w:val="left"/>
+      <w:pPr>
+        <w:tabs>
+          <w:tab w:val="num" w:pos="3600"/>
+        </w:tabs>
+        <w:ind w:left="3600" w:hanging="360"/>
+      </w:pPr>
+      <w:rPr>
+        <w:rFonts w:ascii="Wingdings" w:hAnsi="Wingdings" w:hint="default"/>
+        <w:sz w:val="20"/>
+      </w:rPr>
+    </w:lvl>
+    <w:lvl w:ilvl="5" w:tentative="1">
+      <w:start w:val="1"/>
+      <w:numFmt w:val="bullet"/>
+      <w:lvlText w:val=""/>
+      <w:lvlJc w:val="left"/>
+      <w:pPr>
+        <w:tabs>
+          <w:tab w:val="num" w:pos="4320"/>
+        </w:tabs>
+        <w:ind w:left="4320" w:hanging="360"/>
+      </w:pPr>
+      <w:rPr>
+        <w:rFonts w:ascii="Wingdings" w:hAnsi="Wingdings" w:hint="default"/>
+        <w:sz w:val="20"/>
+      </w:rPr>
+    </w:lvl>
+    <w:lvl w:ilvl="6" w:tentative="1">
+      <w:start w:val="1"/>
+      <w:numFmt w:val="bullet"/>
+      <w:lvlText w:val=""/>
+      <w:lvlJc w:val="left"/>
+      <w:pPr>
+        <w:tabs>
+          <w:tab w:val="num" w:pos="5040"/>
+        </w:tabs>
+        <w:ind w:left="5040" w:hanging="360"/>
+      </w:pPr>
+      <w:rPr>
+        <w:rFonts w:ascii="Wingdings" w:hAnsi="Wingdings" w:hint="default"/>
+        <w:sz w:val="20"/>
+      </w:rPr>
+    </w:lvl>
+    <w:lvl w:ilvl="7" w:tentative="1">
+      <w:start w:val="1"/>
+      <w:numFmt w:val="bullet"/>
+      <w:lvlText w:val=""/>
+      <w:lvlJc w:val="left"/>
+      <w:pPr>
+        <w:tabs>
+          <w:tab w:val="num" w:pos="5760"/>
+        </w:tabs>
+        <w:ind w:left="5760" w:hanging="360"/>
+      </w:pPr>
+      <w:rPr>
+        <w:rFonts w:ascii="Wingdings" w:hAnsi="Wingdings" w:hint="default"/>
+        <w:sz w:val="20"/>
+      </w:rPr>
+    </w:lvl>
+    <w:lvl w:ilvl="8" w:tentative="1">
+      <w:start w:val="1"/>
+      <w:numFmt w:val="bullet"/>
+      <w:lvlText w:val=""/>
+      <w:lvlJc w:val="left"/>
+      <w:pPr>
+        <w:tabs>
+          <w:tab w:val="num" w:pos="6480"/>
+        </w:tabs>
+        <w:ind w:left="6480" w:hanging="360"/>
+      </w:pPr>
+      <w:rPr>
+        <w:rFonts w:ascii="Wingdings" w:hAnsi="Wingdings" w:hint="default"/>
+        <w:sz w:val="20"/>
+      </w:rPr>
+    </w:lvl>
+  </w:abstractNum>
+  <w:abstractNum w:abstractNumId="4" w15:restartNumberingAfterBreak="0">
+    <w:nsid w:val="535A5997"/>
+    <w:multiLevelType w:val="multilevel"/>
+    <w:tmpl w:val="92ECECBC"/>
+    <w:lvl w:ilvl="0">
+      <w:start w:val="1"/>
+      <w:numFmt w:val="bullet"/>
+      <w:lvlText w:val=""/>
+      <w:lvlJc w:val="left"/>
+      <w:pPr>
+        <w:tabs>
+          <w:tab w:val="num" w:pos="720"/>
+        </w:tabs>
+        <w:ind w:left="720" w:hanging="360"/>
+      </w:pPr>
+      <w:rPr>
+        <w:rFonts w:ascii="Symbol" w:hAnsi="Symbol" w:hint="default"/>
+        <w:sz w:val="20"/>
+      </w:rPr>
+    </w:lvl>
+    <w:lvl w:ilvl="1" w:tentative="1">
+      <w:start w:val="1"/>
+      <w:numFmt w:val="bullet"/>
+      <w:lvlText w:val=""/>
+      <w:lvlJc w:val="left"/>
+      <w:pPr>
+        <w:tabs>
+          <w:tab w:val="num" w:pos="1440"/>
+        </w:tabs>
+        <w:ind w:left="1440" w:hanging="360"/>
+      </w:pPr>
+      <w:rPr>
+        <w:rFonts w:ascii="Symbol" w:hAnsi="Symbol" w:hint="default"/>
+        <w:sz w:val="20"/>
+      </w:rPr>
+    </w:lvl>
+    <w:lvl w:ilvl="2" w:tentative="1">
+      <w:start w:val="1"/>
+      <w:numFmt w:val="bullet"/>
+      <w:lvlText w:val=""/>
+      <w:lvlJc w:val="left"/>
+      <w:pPr>
+        <w:tabs>
+          <w:tab w:val="num" w:pos="2160"/>
+        </w:tabs>
+        <w:ind w:left="2160" w:hanging="360"/>
+      </w:pPr>
+      <w:rPr>
+        <w:rFonts w:ascii="Symbol" w:hAnsi="Symbol" w:hint="default"/>
+        <w:sz w:val="20"/>
+      </w:rPr>
+    </w:lvl>
+    <w:lvl w:ilvl="3" w:tentative="1">
+      <w:start w:val="1"/>
+      <w:numFmt w:val="bullet"/>
+      <w:lvlText w:val=""/>
+      <w:lvlJc w:val="left"/>
+      <w:pPr>
+        <w:tabs>
+          <w:tab w:val="num" w:pos="2880"/>
+        </w:tabs>
+        <w:ind w:left="2880" w:hanging="360"/>
+      </w:pPr>
+      <w:rPr>
+        <w:rFonts w:ascii="Symbol" w:hAnsi="Symbol" w:hint="default"/>
+        <w:sz w:val="20"/>
+      </w:rPr>
+    </w:lvl>
+    <w:lvl w:ilvl="4" w:tentative="1">
+      <w:start w:val="1"/>
+      <w:numFmt w:val="bullet"/>
+      <w:lvlText w:val=""/>
+      <w:lvlJc w:val="left"/>
+      <w:pPr>
+        <w:tabs>
+          <w:tab w:val="num" w:pos="3600"/>
+        </w:tabs>
+        <w:ind w:left="3600" w:hanging="360"/>
+      </w:pPr>
+      <w:rPr>
+        <w:rFonts w:ascii="Symbol" w:hAnsi="Symbol" w:hint="default"/>
+        <w:sz w:val="20"/>
+      </w:rPr>
+    </w:lvl>
+    <w:lvl w:ilvl="5" w:tentative="1">
+      <w:start w:val="1"/>
+      <w:numFmt w:val="bullet"/>
+      <w:lvlText w:val=""/>
+      <w:lvlJc w:val="left"/>
+      <w:pPr>
+        <w:tabs>
+          <w:tab w:val="num" w:pos="4320"/>
+        </w:tabs>
+        <w:ind w:left="4320" w:hanging="360"/>
+      </w:pPr>
+      <w:rPr>
+        <w:rFonts w:ascii="Symbol" w:hAnsi="Symbol" w:hint="default"/>
+        <w:sz w:val="20"/>
+      </w:rPr>
+    </w:lvl>
+    <w:lvl w:ilvl="6" w:tentative="1">
+      <w:start w:val="1"/>
+      <w:numFmt w:val="bullet"/>
+      <w:lvlText w:val=""/>
+      <w:lvlJc w:val="left"/>
+      <w:pPr>
+        <w:tabs>
+          <w:tab w:val="num" w:pos="5040"/>
+        </w:tabs>
+        <w:ind w:left="5040" w:hanging="360"/>
+      </w:pPr>
+      <w:rPr>
+        <w:rFonts w:ascii="Symbol" w:hAnsi="Symbol" w:hint="default"/>
+        <w:sz w:val="20"/>
+      </w:rPr>
+    </w:lvl>
+    <w:lvl w:ilvl="7" w:tentative="1">
+      <w:start w:val="1"/>
+      <w:numFmt w:val="bullet"/>
+      <w:lvlText w:val=""/>
+      <w:lvlJc w:val="left"/>
+      <w:pPr>
+        <w:tabs>
+          <w:tab w:val="num" w:pos="5760"/>
+        </w:tabs>
+        <w:ind w:left="5760" w:hanging="360"/>
+      </w:pPr>
+      <w:rPr>
+        <w:rFonts w:ascii="Symbol" w:hAnsi="Symbol" w:hint="default"/>
+        <w:sz w:val="20"/>
+      </w:rPr>
+    </w:lvl>
+    <w:lvl w:ilvl="8" w:tentative="1">
+      <w:start w:val="1"/>
+      <w:numFmt w:val="bullet"/>
+      <w:lvlText w:val=""/>
+      <w:lvlJc w:val="left"/>
+      <w:pPr>
+        <w:tabs>
+          <w:tab w:val="num" w:pos="6480"/>
+        </w:tabs>
+        <w:ind w:left="6480" w:hanging="360"/>
+      </w:pPr>
+      <w:rPr>
+        <w:rFonts w:ascii="Symbol" w:hAnsi="Symbol" w:hint="default"/>
+        <w:sz w:val="20"/>
+      </w:rPr>
+    </w:lvl>
+  </w:abstractNum>
+  <w:abstractNum w:abstractNumId="5" w15:restartNumberingAfterBreak="0">
+    <w:nsid w:val="60ED3797"/>
+    <w:multiLevelType w:val="multilevel"/>
+    <w:tmpl w:val="DA5ECC12"/>
+    <w:lvl w:ilvl="0">
+      <w:start w:val="1"/>
+      <w:numFmt w:val="bullet"/>
+      <w:lvlText w:val=""/>
+      <w:lvlJc w:val="left"/>
+      <w:pPr>
+        <w:tabs>
+          <w:tab w:val="num" w:pos="720"/>
+        </w:tabs>
+        <w:ind w:left="720" w:hanging="360"/>
+      </w:pPr>
+      <w:rPr>
+        <w:rFonts w:ascii="Symbol" w:hAnsi="Symbol" w:hint="default"/>
+        <w:sz w:val="20"/>
+      </w:rPr>
+    </w:lvl>
+    <w:lvl w:ilvl="1" w:tentative="1">
+      <w:start w:val="1"/>
+      <w:numFmt w:val="bullet"/>
+      <w:lvlText w:val=""/>
+      <w:lvlJc w:val="left"/>
+      <w:pPr>
+        <w:tabs>
+          <w:tab w:val="num" w:pos="1440"/>
+        </w:tabs>
+        <w:ind w:left="1440" w:hanging="360"/>
+      </w:pPr>
+      <w:rPr>
+        <w:rFonts w:ascii="Symbol" w:hAnsi="Symbol" w:hint="default"/>
+        <w:sz w:val="20"/>
+      </w:rPr>
+    </w:lvl>
+    <w:lvl w:ilvl="2" w:tentative="1">
+      <w:start w:val="1"/>
+      <w:numFmt w:val="bullet"/>
+      <w:lvlText w:val=""/>
+      <w:lvlJc w:val="left"/>
+      <w:pPr>
+        <w:tabs>
+          <w:tab w:val="num" w:pos="2160"/>
+        </w:tabs>
+        <w:ind w:left="2160" w:hanging="360"/>
+      </w:pPr>
+      <w:rPr>
+        <w:rFonts w:ascii="Symbol" w:hAnsi="Symbol" w:hint="default"/>
+        <w:sz w:val="20"/>
+      </w:rPr>
+    </w:lvl>
+    <w:lvl w:ilvl="3" w:tentative="1">
+      <w:start w:val="1"/>
+      <w:numFmt w:val="bullet"/>
+      <w:lvlText w:val=""/>
+      <w:lvlJc w:val="left"/>
+      <w:pPr>
+        <w:tabs>
+          <w:tab w:val="num" w:pos="2880"/>
+        </w:tabs>
+        <w:ind w:left="2880" w:hanging="360"/>
+      </w:pPr>
+      <w:rPr>
+        <w:rFonts w:ascii="Symbol" w:hAnsi="Symbol" w:hint="default"/>
+        <w:sz w:val="20"/>
+      </w:rPr>
+    </w:lvl>
+    <w:lvl w:ilvl="4" w:tentative="1">
+      <w:start w:val="1"/>
+      <w:numFmt w:val="bullet"/>
+      <w:lvlText w:val=""/>
+      <w:lvlJc w:val="left"/>
+      <w:pPr>
+        <w:tabs>
+          <w:tab w:val="num" w:pos="3600"/>
+        </w:tabs>
+        <w:ind w:left="3600" w:hanging="360"/>
+      </w:pPr>
+      <w:rPr>
+        <w:rFonts w:ascii="Symbol" w:hAnsi="Symbol" w:hint="default"/>
+        <w:sz w:val="20"/>
+      </w:rPr>
+    </w:lvl>
+    <w:lvl w:ilvl="5" w:tentative="1">
+      <w:start w:val="1"/>
+      <w:numFmt w:val="bullet"/>
+      <w:lvlText w:val=""/>
+      <w:lvlJc w:val="left"/>
+      <w:pPr>
+        <w:tabs>
+          <w:tab w:val="num" w:pos="4320"/>
+        </w:tabs>
+        <w:ind w:left="4320" w:hanging="360"/>
+      </w:pPr>
+      <w:rPr>
+        <w:rFonts w:ascii="Symbol" w:hAnsi="Symbol" w:hint="default"/>
+        <w:sz w:val="20"/>
+      </w:rPr>
+    </w:lvl>
+    <w:lvl w:ilvl="6" w:tentative="1">
+      <w:start w:val="1"/>
+      <w:numFmt w:val="bullet"/>
+      <w:lvlText w:val=""/>
+      <w:lvlJc w:val="left"/>
+      <w:pPr>
+        <w:tabs>
+          <w:tab w:val="num" w:pos="5040"/>
+        </w:tabs>
+        <w:ind w:left="5040" w:hanging="360"/>
+      </w:pPr>
+      <w:rPr>
+        <w:rFonts w:ascii="Symbol" w:hAnsi="Symbol" w:hint="default"/>
+        <w:sz w:val="20"/>
+      </w:rPr>
+    </w:lvl>
+    <w:lvl w:ilvl="7" w:tentative="1">
+      <w:start w:val="1"/>
+      <w:numFmt w:val="bullet"/>
+      <w:lvlText w:val=""/>
+      <w:lvlJc w:val="left"/>
+      <w:pPr>
+        <w:tabs>
+          <w:tab w:val="num" w:pos="5760"/>
+        </w:tabs>
+        <w:ind w:left="5760" w:hanging="360"/>
+      </w:pPr>
+      <w:rPr>
+        <w:rFonts w:ascii="Symbol" w:hAnsi="Symbol" w:hint="default"/>
+        <w:sz w:val="20"/>
+      </w:rPr>
+    </w:lvl>
+    <w:lvl w:ilvl="8" w:tentative="1">
+      <w:start w:val="1"/>
+      <w:numFmt w:val="bullet"/>
+      <w:lvlText w:val=""/>
+      <w:lvlJc w:val="left"/>
+      <w:pPr>
+        <w:tabs>
+          <w:tab w:val="num" w:pos="6480"/>
+        </w:tabs>
+        <w:ind w:left="6480" w:hanging="360"/>
+      </w:pPr>
+      <w:rPr>
+        <w:rFonts w:ascii="Symbol" w:hAnsi="Symbol" w:hint="default"/>
+        <w:sz w:val="20"/>
+      </w:rPr>
+    </w:lvl>
+  </w:abstractNum>
   <w:num w:numId="1" w16cid:durableId="323163156">
+    <w:abstractNumId w:val="1"/>
+  </w:num>
+  <w:num w:numId="2" w16cid:durableId="1768114098">
+    <w:abstractNumId w:val="5"/>
+  </w:num>
+  <w:num w:numId="3" w16cid:durableId="1199204628">
+    <w:abstractNumId w:val="2"/>
+  </w:num>
+  <w:num w:numId="4" w16cid:durableId="1755854638">
     <w:abstractNumId w:val="0"/>
+  </w:num>
+  <w:num w:numId="5" w16cid:durableId="247034621">
+    <w:abstractNumId w:val="3"/>
+  </w:num>
+  <w:num w:numId="6" w16cid:durableId="363411111">
+    <w:abstractNumId w:val="4"/>
   </w:num>
 </w:numbering>
 </file>
@@ -997,6 +4170,28 @@
       <w:jc w:val="both"/>
     </w:pPr>
   </w:style>
+  <w:style w:type="paragraph" w:styleId="3">
+    <w:name w:val="heading 3"/>
+    <w:basedOn w:val="a"/>
+    <w:link w:val="30"/>
+    <w:uiPriority w:val="9"/>
+    <w:qFormat/>
+    <w:rsid w:val="009713DB"/>
+    <w:pPr>
+      <w:widowControl/>
+      <w:spacing w:before="100" w:beforeAutospacing="1" w:after="100" w:afterAutospacing="1"/>
+      <w:jc w:val="left"/>
+      <w:outlineLvl w:val="2"/>
+    </w:pPr>
+    <w:rPr>
+      <w:rFonts w:ascii="宋体" w:eastAsia="宋体" w:hAnsi="宋体" w:cs="宋体"/>
+      <w:b/>
+      <w:bCs/>
+      <w:kern w:val="0"/>
+      <w:sz w:val="27"/>
+      <w:szCs w:val="27"/>
+    </w:rPr>
+  </w:style>
   <w:style w:type="character" w:default="1" w:styleId="a0">
     <w:name w:val="Default Paragraph Font"/>
     <w:uiPriority w:val="1"/>
@@ -1058,6 +4253,50 @@
     <w:name w:val="inline-flex"/>
     <w:basedOn w:val="a0"/>
     <w:rsid w:val="00CF2934"/>
+  </w:style>
+  <w:style w:type="character" w:customStyle="1" w:styleId="30">
+    <w:name w:val="标题 3 字符"/>
+    <w:basedOn w:val="a0"/>
+    <w:link w:val="3"/>
+    <w:uiPriority w:val="9"/>
+    <w:rsid w:val="009713DB"/>
+    <w:rPr>
+      <w:rFonts w:ascii="宋体" w:eastAsia="宋体" w:hAnsi="宋体" w:cs="宋体"/>
+      <w:b/>
+      <w:bCs/>
+      <w:kern w:val="0"/>
+      <w:sz w:val="27"/>
+      <w:szCs w:val="27"/>
+    </w:rPr>
+  </w:style>
+  <w:style w:type="character" w:styleId="HTML">
+    <w:name w:val="HTML Code"/>
+    <w:basedOn w:val="a0"/>
+    <w:uiPriority w:val="99"/>
+    <w:semiHidden/>
+    <w:unhideWhenUsed/>
+    <w:rsid w:val="009713DB"/>
+    <w:rPr>
+      <w:rFonts w:ascii="宋体" w:eastAsia="宋体" w:hAnsi="宋体" w:cs="宋体"/>
+      <w:sz w:val="24"/>
+      <w:szCs w:val="24"/>
+    </w:rPr>
+  </w:style>
+  <w:style w:type="paragraph" w:customStyle="1" w:styleId="task-list-item">
+    <w:name w:val="task-list-item"/>
+    <w:basedOn w:val="a"/>
+    <w:rsid w:val="009713DB"/>
+    <w:pPr>
+      <w:widowControl/>
+      <w:spacing w:before="100" w:beforeAutospacing="1" w:after="100" w:afterAutospacing="1"/>
+      <w:jc w:val="left"/>
+    </w:pPr>
+    <w:rPr>
+      <w:rFonts w:ascii="宋体" w:eastAsia="宋体" w:hAnsi="宋体" w:cs="宋体"/>
+      <w:kern w:val="0"/>
+      <w:sz w:val="24"/>
+      <w:szCs w:val="24"/>
+    </w:rPr>
   </w:style>
 </w:styles>
 </file>

</xml_diff>